<commit_message>
revisi referensi dan menambah novelty dari penelitian
</commit_message>
<xml_diff>
--- a/Proposal penelitian prediksi prestasi siswa.docx
+++ b/Proposal penelitian prediksi prestasi siswa.docx
@@ -221,10 +221,7 @@
               <w:spacing w:line="360" w:lineRule="auto"/>
             </w:pPr>
             <w:r>
-              <w:t>23130105</w:t>
-            </w:r>
-            <w:r>
-              <w:t>43</w:t>
+              <w:t>2313010543</w:t>
             </w:r>
           </w:p>
         </w:tc>
@@ -265,10 +262,7 @@
               <w:spacing w:line="360" w:lineRule="auto"/>
             </w:pPr>
             <w:r>
-              <w:t>231301053</w:t>
-            </w:r>
-            <w:r>
-              <w:t>7</w:t>
+              <w:t>2313010537</w:t>
             </w:r>
           </w:p>
         </w:tc>
@@ -309,10 +303,7 @@
               <w:spacing w:line="360" w:lineRule="auto"/>
             </w:pPr>
             <w:r>
-              <w:t>23130105</w:t>
-            </w:r>
-            <w:r>
-              <w:t>38</w:t>
+              <w:t>2313010538</w:t>
             </w:r>
           </w:p>
         </w:tc>
@@ -414,46 +405,16 @@
         <w:ind w:left="491"/>
       </w:pPr>
       <w:r>
-        <w:t>Sebagaimana salah tujuan akhir pemelajaran adalah prestasi</w:t>
-      </w:r>
-      <w:r>
-        <w:t xml:space="preserve"> </w:t>
-      </w:r>
-      <w:r>
-        <w:t xml:space="preserve">belajar, prediksi prestasi belajar </w:t>
-      </w:r>
-      <w:r>
-        <w:t>siswa</w:t>
-      </w:r>
-      <w:r>
-        <w:t xml:space="preserve"> menjadi urgen</w:t>
-      </w:r>
-      <w:r>
-        <w:t xml:space="preserve"> </w:t>
-      </w:r>
-      <w:r>
-        <w:t>untuk dilakukan. Prediksi prestasi belajar siswa dapat</w:t>
-      </w:r>
-      <w:r>
-        <w:t xml:space="preserve"> </w:t>
-      </w:r>
-      <w:r>
-        <w:t xml:space="preserve">dijadikan sebagai dasar untuk melakukan </w:t>
-      </w:r>
-      <w:r>
-        <w:t xml:space="preserve">pencegahan </w:t>
-      </w:r>
-      <w:r>
-        <w:t>terhadap potensi kegagalan peserta didik untuk mencapai</w:t>
-      </w:r>
-      <w:r>
-        <w:t xml:space="preserve"> </w:t>
-      </w:r>
-      <w:r>
-        <w:t>tujuan pemelajaran</w:t>
-      </w:r>
-      <w:r>
-        <w:t xml:space="preserve"> </w:t>
+        <w:t>Sebagaimana salah tujuan akhir pem</w:t>
+      </w:r>
+      <w:r>
+        <w:t>b</w:t>
+      </w:r>
+      <w:r>
+        <w:t xml:space="preserve">elajaran adalah prestasi belajar, prediksi prestasi belajar siswa menjadi urgen untuk dilakukan. Prediksi prestasi belajar siswa dapat dijadikan sebagai dasar untuk melakukan pencegahan terhadap </w:t>
+      </w:r>
+      <w:r>
+        <w:t xml:space="preserve">kurang mampunya identifikasi kebutuhan dan kemampuan siswa </w:t>
       </w:r>
       <w:sdt>
         <w:sdtPr>
@@ -461,8 +422,8 @@
             <w:rFonts w:cs="Times New Roman"/>
             <w:color w:val="000000"/>
           </w:rPr>
-          <w:tag w:val="MENDELEY_CITATION_v3_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"/>
-          <w:id w:val="-1494250991"/>
+          <w:tag w:val="MENDELEY_CITATION_v3_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"/>
+          <w:id w:val="1072158678"/>
           <w:placeholder>
             <w:docPart w:val="DefaultPlaceholder_-1854013440"/>
           </w:placeholder>
@@ -494,7 +455,10 @@
         <w:ind w:left="491"/>
       </w:pPr>
       <w:r>
-        <w:t>Klasifikasi yang didasarkan pada sistem informasi merupakan teknik memetakan (mengklasifikasikan) data ke dalam satu atau beberapa kelas yang sudah didefinisikan sebelumnya</w:t>
+        <w:t xml:space="preserve">Klasifikasi yang didasarkan pada sistem informasi </w:t>
+      </w:r>
+      <w:r>
+        <w:t>merupakan proses menemukan model yang menggambarkan dan membedakan kelas data yang bertujuan untuk memperkirakan kelas dari objek yang belum diketahui labelnya</w:t>
       </w:r>
       <w:r>
         <w:t xml:space="preserve"> </w:t>
@@ -505,8 +469,8 @@
             <w:rFonts w:cs="Times New Roman"/>
             <w:color w:val="000000"/>
           </w:rPr>
-          <w:tag w:val="MENDELEY_CITATION_v3_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"/>
-          <w:id w:val="1556272645"/>
+          <w:tag w:val="MENDELEY_CITATION_v3_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"/>
+          <w:id w:val="-1734537157"/>
           <w:placeholder>
             <w:docPart w:val="DefaultPlaceholder_-1854013440"/>
           </w:placeholder>
@@ -530,10 +494,10 @@
     </w:p>
     <w:p>
       <w:pPr>
-        <w:ind w:left="491"/>
-      </w:pPr>
-      <w:r>
-        <w:t>Dalam skala global, platform Kaggle menyediakan repositori dataset multinasional yang mencakup variabel kompleks penentu prestasi siswa (seperti konsumsi alkohol akhir pekan, tingkat pendidikan orang tua, dan waktu belajar mandiri). Penelitian ini memanfaatkan data sekunder berskala publik dari Kaggle</w:t>
+        <w:ind w:left="491" w:firstLine="0"/>
+      </w:pPr>
+      <w:r>
+        <w:t>Dalam skala global, platform Kaggle menyediakan repositori dataset multinasional yang mencakup variabel kompleks penentu prestasi siswa (seperti tingkat pendidikan orang tua, dan waktu belajar mandiri). Penelitian ini memanfaatkan data sekunder berskala publik dari Kaggle</w:t>
       </w:r>
       <w:r>
         <w:t xml:space="preserve"> </w:t>
@@ -572,7 +536,7 @@
             <w:rFonts w:cs="Times New Roman"/>
             <w:color w:val="000000"/>
           </w:rPr>
-          <w:tag w:val="MENDELEY_CITATION_v3_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"/>
+          <w:tag w:val="MENDELEY_CITATION_v3_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"/>
           <w:id w:val="-40434832"/>
           <w:placeholder>
             <w:docPart w:val="DefaultPlaceholder_-1854013440"/>
@@ -600,8 +564,8 @@
             <w:rFonts w:cs="Times New Roman"/>
             <w:color w:val="000000"/>
           </w:rPr>
-          <w:tag w:val="MENDELEY_CITATION_v3_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"/>
-          <w:id w:val="888528883"/>
+          <w:tag w:val="MENDELEY_CITATION_v3_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"/>
+          <w:id w:val="-1181893844"/>
           <w:placeholder>
             <w:docPart w:val="DefaultPlaceholder_-1854013440"/>
           </w:placeholder>
@@ -619,13 +583,34 @@
       <w:r>
         <w:t>, dalam memprediksi tingkat kelulusan atau nilai akhir siswa.</w:t>
       </w:r>
+      <w:r>
+        <w:t xml:space="preserve"> </w:t>
+      </w:r>
+      <w:r>
+        <w:t>Penelitian ini bertujuan untuk membandingkan performa algoritma K-Ne</w:t>
+      </w:r>
+      <w:r>
+        <w:t xml:space="preserve"> </w:t>
+      </w:r>
+      <w:r>
+        <w:t xml:space="preserve">arest Neighbor (KNN) dan </w:t>
+      </w:r>
+      <w:r>
+        <w:lastRenderedPageBreak/>
+        <w:t>Decision Tree dalam memprediksi tingkat prestasi siswa menggunakan dataset sekunder berbasis publik dari Kaggle</w:t>
+      </w:r>
+      <w:r>
+        <w:t xml:space="preserve"> dengan menyertakan variabel non-akademik sebagai evaluasi prediksinya </w:t>
+      </w:r>
+      <w:r>
+        <w:t>menggunakan metrik evaluasi akurasi, presisi, recall, dan F1-Score.</w:t>
+      </w:r>
     </w:p>
     <w:p>
       <w:pPr>
         <w:pStyle w:val="Heading1"/>
       </w:pPr>
       <w:r>
-        <w:lastRenderedPageBreak/>
         <w:t>RUMUSAN MASALAH</w:t>
       </w:r>
     </w:p>
@@ -635,11 +620,145 @@
           <w:lang w:val="en-ID"/>
         </w:rPr>
       </w:pPr>
-      <w:r>
-        <w:rPr>
-          <w:lang w:val="en-ID"/>
-        </w:rPr>
-        <w:t>Berdasarkan latar belakang di atas, rumusan masalah dalam penelitian ini adalah:</w:t>
+      <w:proofErr w:type="spellStart"/>
+      <w:r>
+        <w:rPr>
+          <w:lang w:val="en-ID"/>
+        </w:rPr>
+        <w:t>Berdasarkan</w:t>
+      </w:r>
+      <w:proofErr w:type="spellEnd"/>
+      <w:r>
+        <w:rPr>
+          <w:lang w:val="en-ID"/>
+        </w:rPr>
+        <w:t xml:space="preserve"> </w:t>
+      </w:r>
+      <w:proofErr w:type="spellStart"/>
+      <w:r>
+        <w:rPr>
+          <w:lang w:val="en-ID"/>
+        </w:rPr>
+        <w:t>latar</w:t>
+      </w:r>
+      <w:proofErr w:type="spellEnd"/>
+      <w:r>
+        <w:rPr>
+          <w:lang w:val="en-ID"/>
+        </w:rPr>
+        <w:t xml:space="preserve"> </w:t>
+      </w:r>
+      <w:proofErr w:type="spellStart"/>
+      <w:r>
+        <w:rPr>
+          <w:lang w:val="en-ID"/>
+        </w:rPr>
+        <w:t>belakang</w:t>
+      </w:r>
+      <w:proofErr w:type="spellEnd"/>
+      <w:r>
+        <w:rPr>
+          <w:lang w:val="en-ID"/>
+        </w:rPr>
+        <w:t xml:space="preserve"> di </w:t>
+      </w:r>
+      <w:proofErr w:type="spellStart"/>
+      <w:r>
+        <w:rPr>
+          <w:lang w:val="en-ID"/>
+        </w:rPr>
+        <w:t>atas</w:t>
+      </w:r>
+      <w:proofErr w:type="spellEnd"/>
+      <w:r>
+        <w:rPr>
+          <w:lang w:val="en-ID"/>
+        </w:rPr>
+        <w:t xml:space="preserve">, </w:t>
+      </w:r>
+      <w:proofErr w:type="spellStart"/>
+      <w:r>
+        <w:rPr>
+          <w:lang w:val="en-ID"/>
+        </w:rPr>
+        <w:t>rumusan</w:t>
+      </w:r>
+      <w:proofErr w:type="spellEnd"/>
+      <w:r>
+        <w:rPr>
+          <w:lang w:val="en-ID"/>
+        </w:rPr>
+        <w:t xml:space="preserve"> </w:t>
+      </w:r>
+      <w:proofErr w:type="spellStart"/>
+      <w:r>
+        <w:rPr>
+          <w:lang w:val="en-ID"/>
+        </w:rPr>
+        <w:t>masalah</w:t>
+      </w:r>
+      <w:proofErr w:type="spellEnd"/>
+      <w:r>
+        <w:rPr>
+          <w:lang w:val="en-ID"/>
+        </w:rPr>
+        <w:t xml:space="preserve"> </w:t>
+      </w:r>
+      <w:proofErr w:type="spellStart"/>
+      <w:r>
+        <w:rPr>
+          <w:lang w:val="en-ID"/>
+        </w:rPr>
+        <w:t>dalam</w:t>
+      </w:r>
+      <w:proofErr w:type="spellEnd"/>
+      <w:r>
+        <w:rPr>
+          <w:lang w:val="en-ID"/>
+        </w:rPr>
+        <w:t xml:space="preserve"> </w:t>
+      </w:r>
+      <w:proofErr w:type="spellStart"/>
+      <w:r>
+        <w:rPr>
+          <w:lang w:val="en-ID"/>
+        </w:rPr>
+        <w:t>penelitian</w:t>
+      </w:r>
+      <w:proofErr w:type="spellEnd"/>
+      <w:r>
+        <w:rPr>
+          <w:lang w:val="en-ID"/>
+        </w:rPr>
+        <w:t xml:space="preserve"> </w:t>
+      </w:r>
+      <w:proofErr w:type="spellStart"/>
+      <w:r>
+        <w:rPr>
+          <w:lang w:val="en-ID"/>
+        </w:rPr>
+        <w:t>ini</w:t>
+      </w:r>
+      <w:proofErr w:type="spellEnd"/>
+      <w:r>
+        <w:rPr>
+          <w:lang w:val="en-ID"/>
+        </w:rPr>
+        <w:t xml:space="preserve"> </w:t>
+      </w:r>
+      <w:proofErr w:type="spellStart"/>
+      <w:r>
+        <w:rPr>
+          <w:lang w:val="en-ID"/>
+        </w:rPr>
+        <w:t>adalah</w:t>
+      </w:r>
+      <w:proofErr w:type="spellEnd"/>
+      <w:r>
+        <w:rPr>
+          <w:lang w:val="en-ID"/>
+        </w:rPr>
+        <w:t>:</w:t>
       </w:r>
     </w:p>
     <w:p>
@@ -733,7 +852,13 @@
         <w:t xml:space="preserve">memiliki kinerja yang </w:t>
       </w:r>
       <w:r>
-        <w:t>sangat baik dalam menangani data yang memiliki relasi lokal yang kuat</w:t>
+        <w:t xml:space="preserve">sederhana namun </w:t>
+      </w:r>
+      <w:r>
+        <w:t xml:space="preserve">sangat baik dalam menangani data yang memiliki </w:t>
+      </w:r>
+      <w:r>
+        <w:t>label kelas yang sama</w:t>
       </w:r>
       <w:r>
         <w:t xml:space="preserve"> </w:t>
@@ -744,8 +869,8 @@
             <w:rFonts w:cs="Times New Roman"/>
             <w:color w:val="000000"/>
           </w:rPr>
-          <w:tag w:val="MENDELEY_CITATION_v3_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"/>
-          <w:id w:val="-803236571"/>
+          <w:tag w:val="MENDELEY_CITATION_v3_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"/>
+          <w:id w:val="-1634323360"/>
           <w:placeholder>
             <w:docPart w:val="DefaultPlaceholder_-1854013440"/>
           </w:placeholder>
@@ -756,30 +881,31 @@
               <w:rFonts w:cs="Times New Roman"/>
               <w:color w:val="000000"/>
             </w:rPr>
-            <w:t>[2]</w:t>
+            <w:t>[6]</w:t>
           </w:r>
         </w:sdtContent>
       </w:sdt>
       <w:r>
-        <w:t xml:space="preserve">, namun performanya sensitif terhadap skala fitur.  Sementara itu, Decision Tree </w:t>
-      </w:r>
-      <w:r>
-        <w:t>dibentuk dari proses penyortiran rekursif</w:t>
+        <w:t xml:space="preserve">, namun performanya sensitif terhadap skala </w:t>
+      </w:r>
+      <w:r>
+        <w:lastRenderedPageBreak/>
+        <w:t xml:space="preserve">fitur.  Sementara itu, Decision Tree </w:t>
+      </w:r>
+      <w:r>
+        <w:t>dibentuk dari proses penyortiran rekursif biner dalam kelompok data,</w:t>
       </w:r>
       <w:r>
         <w:t xml:space="preserve"> </w:t>
       </w:r>
       <w:r>
-        <w:t>biner dalam kelompok data,sehingga nilai</w:t>
-      </w:r>
-      <w:r>
-        <w:t xml:space="preserve"> </w:t>
-      </w:r>
-      <w:r>
-        <w:t>variable respons disetiap kelompok</w:t>
-      </w:r>
-      <w:r>
-        <w:t xml:space="preserve"> </w:t>
+        <w:t>sehingga nilai variabe</w:t>
+      </w:r>
+      <w:r>
+        <w:t>l</w:t>
+      </w:r>
+      <w:r>
+        <w:t xml:space="preserve"> respons disetiap kelompok </w:t>
       </w:r>
       <w:sdt>
         <w:sdtPr>
@@ -787,8 +913,8 @@
             <w:rFonts w:cs="Times New Roman"/>
             <w:color w:val="000000"/>
           </w:rPr>
-          <w:tag w:val="MENDELEY_CITATION_v3_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"/>
-          <w:id w:val="1460451897"/>
+          <w:tag w:val="MENDELEY_CITATION_v3_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"/>
+          <w:id w:val="1611464064"/>
           <w:placeholder>
             <w:docPart w:val="DefaultPlaceholder_-1854013440"/>
           </w:placeholder>
@@ -815,7 +941,6 @@
         <w:pStyle w:val="Heading1"/>
       </w:pPr>
       <w:r>
-        <w:lastRenderedPageBreak/>
         <w:t>TUJUAN</w:t>
       </w:r>
     </w:p>
@@ -884,7 +1009,7 @@
             <w:rFonts w:cs="Times New Roman"/>
             <w:color w:val="000000"/>
           </w:rPr>
-          <w:tag w:val="MENDELEY_CITATION_v3_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"/>
+          <w:tag w:val="MENDELEY_CITATION_v3_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"/>
           <w:id w:val="1879427161"/>
           <w:placeholder>
             <w:docPart w:val="DefaultPlaceholder_-1854013440"/>
@@ -896,7 +1021,7 @@
               <w:rFonts w:cs="Times New Roman"/>
               <w:color w:val="000000"/>
             </w:rPr>
-            <w:t>[6]</w:t>
+            <w:t>[7]</w:t>
           </w:r>
         </w:sdtContent>
       </w:sdt>
@@ -950,6 +1075,7 @@
           <w:lang w:val="en-ID"/>
         </w:rPr>
       </w:pPr>
+      <w:proofErr w:type="spellStart"/>
       <w:r>
         <w:rPr>
           <w:lang w:val="en-ID"/>
@@ -960,26 +1086,169 @@
         <w:rPr>
           <w:lang w:val="en-ID"/>
         </w:rPr>
-        <w:t>emberikan dukungan kepada sekolah dalam memprediksi prestasi siswa,</w:t>
-      </w:r>
+        <w:t>emberikan</w:t>
+      </w:r>
+      <w:proofErr w:type="spellEnd"/>
       <w:r>
         <w:rPr>
           <w:lang w:val="en-ID"/>
         </w:rPr>
         <w:t xml:space="preserve"> </w:t>
       </w:r>
-      <w:r>
-        <w:rPr>
-          <w:lang w:val="en-ID"/>
-        </w:rPr>
-        <w:t xml:space="preserve">sehingga dapat di lakukan </w:t>
-      </w:r>
+      <w:proofErr w:type="spellStart"/>
+      <w:r>
+        <w:rPr>
+          <w:lang w:val="en-ID"/>
+        </w:rPr>
+        <w:t>dukungan</w:t>
+      </w:r>
+      <w:proofErr w:type="spellEnd"/>
+      <w:r>
+        <w:rPr>
+          <w:lang w:val="en-ID"/>
+        </w:rPr>
+        <w:t xml:space="preserve"> </w:t>
+      </w:r>
+      <w:proofErr w:type="spellStart"/>
+      <w:r>
+        <w:rPr>
+          <w:lang w:val="en-ID"/>
+        </w:rPr>
+        <w:t>kepada</w:t>
+      </w:r>
+      <w:proofErr w:type="spellEnd"/>
+      <w:r>
+        <w:rPr>
+          <w:lang w:val="en-ID"/>
+        </w:rPr>
+        <w:t xml:space="preserve"> </w:t>
+      </w:r>
+      <w:proofErr w:type="spellStart"/>
+      <w:r>
+        <w:rPr>
+          <w:lang w:val="en-ID"/>
+        </w:rPr>
+        <w:t>sekolah</w:t>
+      </w:r>
+      <w:proofErr w:type="spellEnd"/>
+      <w:r>
+        <w:rPr>
+          <w:lang w:val="en-ID"/>
+        </w:rPr>
+        <w:t xml:space="preserve"> </w:t>
+      </w:r>
+      <w:proofErr w:type="spellStart"/>
+      <w:r>
+        <w:rPr>
+          <w:lang w:val="en-ID"/>
+        </w:rPr>
+        <w:t>dalam</w:t>
+      </w:r>
+      <w:proofErr w:type="spellEnd"/>
+      <w:r>
+        <w:rPr>
+          <w:lang w:val="en-ID"/>
+        </w:rPr>
+        <w:t xml:space="preserve"> </w:t>
+      </w:r>
+      <w:proofErr w:type="spellStart"/>
+      <w:r>
+        <w:rPr>
+          <w:lang w:val="en-ID"/>
+        </w:rPr>
+        <w:t>memprediksi</w:t>
+      </w:r>
+      <w:proofErr w:type="spellEnd"/>
+      <w:r>
+        <w:rPr>
+          <w:lang w:val="en-ID"/>
+        </w:rPr>
+        <w:t xml:space="preserve"> </w:t>
+      </w:r>
+      <w:proofErr w:type="spellStart"/>
+      <w:r>
+        <w:rPr>
+          <w:lang w:val="en-ID"/>
+        </w:rPr>
+        <w:t>prestasi</w:t>
+      </w:r>
+      <w:proofErr w:type="spellEnd"/>
+      <w:r>
+        <w:rPr>
+          <w:lang w:val="en-ID"/>
+        </w:rPr>
+        <w:t xml:space="preserve"> </w:t>
+      </w:r>
+      <w:proofErr w:type="spellStart"/>
+      <w:r>
+        <w:rPr>
+          <w:lang w:val="en-ID"/>
+        </w:rPr>
+        <w:t>siswa</w:t>
+      </w:r>
+      <w:proofErr w:type="spellEnd"/>
+      <w:r>
+        <w:rPr>
+          <w:lang w:val="en-ID"/>
+        </w:rPr>
+        <w:t>,</w:t>
+      </w:r>
+      <w:r>
+        <w:rPr>
+          <w:lang w:val="en-ID"/>
+        </w:rPr>
+        <w:t xml:space="preserve"> </w:t>
+      </w:r>
+      <w:proofErr w:type="spellStart"/>
+      <w:r>
+        <w:rPr>
+          <w:lang w:val="en-ID"/>
+        </w:rPr>
+        <w:t>sehingga</w:t>
+      </w:r>
+      <w:proofErr w:type="spellEnd"/>
+      <w:r>
+        <w:rPr>
+          <w:lang w:val="en-ID"/>
+        </w:rPr>
+        <w:t xml:space="preserve"> </w:t>
+      </w:r>
+      <w:proofErr w:type="spellStart"/>
+      <w:r>
+        <w:rPr>
+          <w:lang w:val="en-ID"/>
+        </w:rPr>
+        <w:t>dapat</w:t>
+      </w:r>
+      <w:proofErr w:type="spellEnd"/>
+      <w:r>
+        <w:rPr>
+          <w:lang w:val="en-ID"/>
+        </w:rPr>
+        <w:t xml:space="preserve"> di </w:t>
+      </w:r>
+      <w:proofErr w:type="spellStart"/>
+      <w:r>
+        <w:rPr>
+          <w:lang w:val="en-ID"/>
+        </w:rPr>
+        <w:t>lakukan</w:t>
+      </w:r>
+      <w:proofErr w:type="spellEnd"/>
+      <w:r>
+        <w:rPr>
+          <w:lang w:val="en-ID"/>
+        </w:rPr>
+        <w:t xml:space="preserve"> </w:t>
+      </w:r>
+      <w:proofErr w:type="spellStart"/>
       <w:r>
         <w:rPr>
           <w:lang w:val="en-ID"/>
         </w:rPr>
         <w:t>langkah</w:t>
       </w:r>
+      <w:proofErr w:type="spellEnd"/>
       <w:r>
         <w:rPr>
           <w:lang w:val="en-ID"/>
@@ -990,50 +1259,86 @@
         <w:rPr>
           <w:lang w:val="en-ID"/>
         </w:rPr>
-        <w:t xml:space="preserve">– langkah </w:t>
-      </w:r>
-      <w:r>
-        <w:rPr>
-          <w:lang w:val="en-ID"/>
-        </w:rPr>
-        <w:t>antisipatif dalam</w:t>
-      </w:r>
+        <w:t xml:space="preserve">– </w:t>
+      </w:r>
+      <w:proofErr w:type="spellStart"/>
+      <w:r>
+        <w:rPr>
+          <w:lang w:val="en-ID"/>
+        </w:rPr>
+        <w:t>langkah</w:t>
+      </w:r>
+      <w:proofErr w:type="spellEnd"/>
       <w:r>
         <w:rPr>
           <w:lang w:val="en-ID"/>
         </w:rPr>
         <w:t xml:space="preserve"> </w:t>
       </w:r>
+      <w:proofErr w:type="spellStart"/>
+      <w:r>
+        <w:rPr>
+          <w:lang w:val="en-ID"/>
+        </w:rPr>
+        <w:t>antisipatif</w:t>
+      </w:r>
+      <w:proofErr w:type="spellEnd"/>
+      <w:r>
+        <w:rPr>
+          <w:lang w:val="en-ID"/>
+        </w:rPr>
+        <w:t xml:space="preserve"> </w:t>
+      </w:r>
+      <w:proofErr w:type="spellStart"/>
+      <w:r>
+        <w:rPr>
+          <w:lang w:val="en-ID"/>
+        </w:rPr>
+        <w:t>dalam</w:t>
+      </w:r>
+      <w:proofErr w:type="spellEnd"/>
+      <w:r>
+        <w:rPr>
+          <w:lang w:val="en-ID"/>
+        </w:rPr>
+        <w:t xml:space="preserve"> </w:t>
+      </w:r>
+      <w:proofErr w:type="spellStart"/>
       <w:r>
         <w:rPr>
           <w:lang w:val="en-ID"/>
         </w:rPr>
         <w:t>mengelola</w:t>
       </w:r>
+      <w:proofErr w:type="spellEnd"/>
       <w:r>
         <w:rPr>
           <w:lang w:val="en-ID"/>
         </w:rPr>
         <w:t xml:space="preserve"> </w:t>
       </w:r>
+      <w:proofErr w:type="spellStart"/>
       <w:r>
         <w:rPr>
           <w:lang w:val="en-ID"/>
         </w:rPr>
         <w:t>prestasi</w:t>
       </w:r>
+      <w:proofErr w:type="spellEnd"/>
       <w:r>
         <w:rPr>
           <w:lang w:val="en-ID"/>
         </w:rPr>
         <w:t xml:space="preserve"> </w:t>
       </w:r>
+      <w:proofErr w:type="spellStart"/>
       <w:r>
         <w:rPr>
           <w:lang w:val="en-ID"/>
         </w:rPr>
         <w:t>siswa</w:t>
       </w:r>
+      <w:proofErr w:type="spellEnd"/>
       <w:r>
         <w:rPr>
           <w:lang w:val="en-ID"/>
@@ -1044,8 +1349,30 @@
         <w:rPr>
           <w:lang w:val="en-ID"/>
         </w:rPr>
-        <w:t>di lingkungan sekolah</w:t>
-      </w:r>
+        <w:t xml:space="preserve">di </w:t>
+      </w:r>
+      <w:proofErr w:type="spellStart"/>
+      <w:r>
+        <w:rPr>
+          <w:lang w:val="en-ID"/>
+        </w:rPr>
+        <w:t>lingkungan</w:t>
+      </w:r>
+      <w:proofErr w:type="spellEnd"/>
+      <w:r>
+        <w:rPr>
+          <w:lang w:val="en-ID"/>
+        </w:rPr>
+        <w:t xml:space="preserve"> </w:t>
+      </w:r>
+      <w:proofErr w:type="spellStart"/>
+      <w:r>
+        <w:rPr>
+          <w:lang w:val="en-ID"/>
+        </w:rPr>
+        <w:t>sekolah</w:t>
+      </w:r>
+      <w:proofErr w:type="spellEnd"/>
       <w:r>
         <w:rPr>
           <w:lang w:val="en-ID"/>
@@ -1059,7 +1386,7 @@
             <w:color w:val="000000"/>
             <w:lang w:val="en-ID"/>
           </w:rPr>
-          <w:tag w:val="MENDELEY_CITATION_v3_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"/>
+          <w:tag w:val="MENDELEY_CITATION_v3_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"/>
           <w:id w:val="-1764139562"/>
           <w:placeholder>
             <w:docPart w:val="DefaultPlaceholder_-1854013440"/>
@@ -1072,7 +1399,7 @@
               <w:color w:val="000000"/>
               <w:lang w:val="en-ID"/>
             </w:rPr>
-            <w:t>[6]</w:t>
+            <w:t>[7]</w:t>
           </w:r>
         </w:sdtContent>
       </w:sdt>
@@ -1147,6 +1474,7 @@
           <w:bCs/>
           <w:lang w:val="fi-FI"/>
         </w:rPr>
+        <w:lastRenderedPageBreak/>
         <w:t>Luaran Tambahan:</w:t>
       </w:r>
       <w:r>
@@ -1231,7 +1559,6 @@
         <w:pStyle w:val="Heading1"/>
       </w:pPr>
       <w:r>
-        <w:lastRenderedPageBreak/>
         <w:t>METODE PENELITIAN</w:t>
       </w:r>
     </w:p>
@@ -1271,7 +1598,7 @@
             <w:rFonts w:cs="Times New Roman"/>
             <w:color w:val="000000"/>
           </w:rPr>
-          <w:tag w:val="MENDELEY_CITATION_v3_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"/>
+          <w:tag w:val="MENDELEY_CITATION_v3_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"/>
           <w:id w:val="-839006013"/>
           <w:placeholder>
             <w:docPart w:val="DefaultPlaceholder_-1854013440"/>
@@ -1283,7 +1610,7 @@
               <w:rFonts w:cs="Times New Roman"/>
               <w:color w:val="000000"/>
             </w:rPr>
-            <w:t>[7]</w:t>
+            <w:t>[8]</w:t>
           </w:r>
         </w:sdtContent>
       </w:sdt>
@@ -1411,7 +1738,7 @@
             <w:rFonts w:cs="Times New Roman"/>
             <w:color w:val="000000"/>
           </w:rPr>
-          <w:tag w:val="MENDELEY_CITATION_v3_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"/>
+          <w:tag w:val="MENDELEY_CITATION_v3_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"/>
           <w:id w:val="-458574063"/>
           <w:placeholder>
             <w:docPart w:val="DefaultPlaceholder_-1854013440"/>
@@ -1423,7 +1750,7 @@
               <w:rFonts w:cs="Times New Roman"/>
               <w:color w:val="000000"/>
             </w:rPr>
-            <w:t>[7]</w:t>
+            <w:t>[8]</w:t>
           </w:r>
         </w:sdtContent>
       </w:sdt>
@@ -1465,6 +1792,7 @@
           <w:b/>
           <w:bCs/>
         </w:rPr>
+        <w:lastRenderedPageBreak/>
         <w:t>Pembagian Data (</w:t>
       </w:r>
       <w:r>
@@ -1522,7 +1850,7 @@
             <w:rFonts w:cs="Times New Roman"/>
             <w:color w:val="000000"/>
           </w:rPr>
-          <w:tag w:val="MENDELEY_CITATION_v3_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"/>
+          <w:tag w:val="MENDELEY_CITATION_v3_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"/>
           <w:id w:val="1032081740"/>
           <w:placeholder>
             <w:docPart w:val="DefaultPlaceholder_-1854013440"/>
@@ -1534,7 +1862,7 @@
               <w:rFonts w:cs="Times New Roman"/>
               <w:color w:val="000000"/>
             </w:rPr>
-            <w:t>[8]</w:t>
+            <w:t>[9]</w:t>
           </w:r>
         </w:sdtContent>
       </w:sdt>
@@ -1563,7 +1891,6 @@
           <w:b/>
           <w:bCs/>
         </w:rPr>
-        <w:lastRenderedPageBreak/>
         <w:t>Pemodelan &amp; Pengujian:</w:t>
       </w:r>
       <w:r>
@@ -1677,7 +2004,7 @@
             <w:iCs/>
             <w:color w:val="000000"/>
           </w:rPr>
-          <w:tag w:val="MENDELEY_CITATION_v3_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"/>
+          <w:tag w:val="MENDELEY_CITATION_v3_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"/>
           <w:id w:val="-1416702683"/>
           <w:placeholder>
             <w:docPart w:val="DefaultPlaceholder_-1854013440"/>
@@ -1689,7 +2016,7 @@
               <w:rFonts w:cs="Times New Roman"/>
               <w:color w:val="000000"/>
             </w:rPr>
-            <w:t>[9]</w:t>
+            <w:t>[10]</w:t>
           </w:r>
         </w:sdtContent>
       </w:sdt>
@@ -1999,7 +2326,11 @@
         <w:t>StandardScaler</w:t>
       </w:r>
       <w:r>
-        <w:t xml:space="preserve">. Sementara itu, algoritma </w:t>
+        <w:t xml:space="preserve">. Sementara itu, </w:t>
+      </w:r>
+      <w:r>
+        <w:lastRenderedPageBreak/>
+        <w:t xml:space="preserve">algoritma </w:t>
       </w:r>
       <w:r>
         <w:rPr>
@@ -2059,11 +2390,7 @@
         <w:t>Entropy</w:t>
       </w:r>
       <w:r>
-        <w:t xml:space="preserve"> maupun melalui </w:t>
-      </w:r>
-      <w:r>
-        <w:lastRenderedPageBreak/>
-        <w:t xml:space="preserve">perhitungan </w:t>
+        <w:t xml:space="preserve"> maupun melalui perhitungan </w:t>
       </w:r>
       <w:r>
         <w:rPr>
@@ -2184,7 +2511,7 @@
             <w:rFonts w:cs="Times New Roman"/>
             <w:color w:val="000000"/>
           </w:rPr>
-          <w:tag w:val="MENDELEY_CITATION_v3_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"/>
+          <w:tag w:val="MENDELEY_CITATION_v3_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"/>
           <w:id w:val="244377891"/>
           <w:placeholder>
             <w:docPart w:val="DefaultPlaceholder_-1854013440"/>
@@ -2196,7 +2523,7 @@
               <w:rFonts w:cs="Times New Roman"/>
               <w:color w:val="000000"/>
             </w:rPr>
-            <w:t>[10]</w:t>
+            <w:t>[11]</w:t>
           </w:r>
         </w:sdtContent>
       </w:sdt>
@@ -2273,27 +2600,14 @@
       <w:r>
         <w:t xml:space="preserve">Gambar </w:t>
       </w:r>
-      <w:r>
-        <w:fldChar w:fldCharType="begin"/>
-      </w:r>
-      <w:r>
-        <w:instrText xml:space="preserve"> SEQ Gambar \* ARABIC </w:instrText>
-      </w:r>
-      <w:r>
-        <w:fldChar w:fldCharType="separate"/>
-      </w:r>
-      <w:r>
-        <w:rPr>
-          <w:noProof/>
-        </w:rPr>
-        <w:t>1</w:t>
-      </w:r>
-      <w:r>
-        <w:rPr>
-          <w:noProof/>
-        </w:rPr>
-        <w:fldChar w:fldCharType="end"/>
-      </w:r>
+      <w:fldSimple w:instr=" SEQ Gambar \* ARABIC ">
+        <w:r>
+          <w:rPr>
+            <w:noProof/>
+          </w:rPr>
+          <w:t>1</w:t>
+        </w:r>
+      </w:fldSimple>
       <w:bookmarkEnd w:id="0"/>
       <w:r>
         <w:t xml:space="preserve">. </w:t>
@@ -2345,7 +2659,7 @@
           <w:color w:val="000000"/>
         </w:rPr>
         <w:tag w:val="MENDELEY_BIBLIOGRAPHY"/>
-        <w:id w:val="1839428361"/>
+        <w:id w:val="-173259659"/>
         <w:placeholder>
           <w:docPart w:val="DefaultPlaceholder_-1854013440"/>
         </w:placeholder>
@@ -2356,7 +2670,7 @@
             <w:autoSpaceDE w:val="0"/>
             <w:autoSpaceDN w:val="0"/>
             <w:ind w:hanging="640"/>
-            <w:divId w:val="843935136"/>
+            <w:divId w:val="1469281896"/>
             <w:rPr>
               <w:rFonts w:eastAsia="Times New Roman" w:cs="Times New Roman"/>
               <w:color w:val="000000"/>
@@ -2376,23 +2690,7 @@
               <w:color w:val="000000"/>
             </w:rPr>
             <w:tab/>
-            <w:t xml:space="preserve">S. A. Rajagukguk, “TINJAUAN PUSTAKA SISTEMATIS: PREDIKSI PRESTASI BELAJAR PESERTA DIDIK DENGAN ALGORITMA PEMBELAJARAN MESIN,” </w:t>
-          </w:r>
-          <w:r>
-            <w:rPr>
-              <w:rFonts w:eastAsia="Times New Roman" w:cs="Times New Roman"/>
-              <w:i/>
-              <w:iCs/>
-              <w:color w:val="000000"/>
-            </w:rPr>
-            <w:t>Jurnal Sains, Nalar, dan Aplikasi Teknologi Informasi</w:t>
-          </w:r>
-          <w:r>
-            <w:rPr>
-              <w:rFonts w:eastAsia="Times New Roman" w:cs="Times New Roman"/>
-              <w:color w:val="000000"/>
-            </w:rPr>
-            <w:t>, vol. 1, no. 1, Aug. 2021, doi: 10.20885/snati.v1i1.4.</w:t>
+            <w:t>H. Lestari, A. Irma Purnamasari, and T. Suprapti, “PENERAPAN DATA MINING MENGGUNAKAN ALGORITMA C4.5 UNTUK PREDIKSI PRESTASI BELAJAR SISWA DI MTS YAMUALLIM PANONGAN,” 2024.</w:t>
           </w:r>
         </w:p>
         <w:p>
@@ -2400,7 +2698,7 @@
             <w:autoSpaceDE w:val="0"/>
             <w:autoSpaceDN w:val="0"/>
             <w:ind w:hanging="640"/>
-            <w:divId w:val="1933076762"/>
+            <w:divId w:val="905913888"/>
             <w:rPr>
               <w:rFonts w:eastAsia="Times New Roman" w:cs="Times New Roman"/>
               <w:color w:val="000000"/>
@@ -2419,7 +2717,7 @@
               <w:color w:val="000000"/>
             </w:rPr>
             <w:tab/>
-            <w:t>J. Homepage, S. R. Cholil, T. Handayani, R. Prathivi, and T. Ardianita, “IJCIT (Indonesian Journal on Computer and Information Technology) Implementasi Algoritma Klasifikasi K-Nearest Neighbor (KNN) Untuk Klasifikasi Seleksi Penerima Beasiswa,” 2021.</w:t>
+            <w:t>T. Hardoyo and E. H. Parmadi, “Klasifikasi Usaha Mikro Kecil Menengah Menggunakan Jaringan Syaraf Tiruan Backpropagation,” 2022.</w:t>
           </w:r>
         </w:p>
         <w:p>
@@ -2427,7 +2725,7 @@
             <w:autoSpaceDE w:val="0"/>
             <w:autoSpaceDN w:val="0"/>
             <w:ind w:hanging="640"/>
-            <w:divId w:val="1823235824"/>
+            <w:divId w:val="149365717"/>
             <w:rPr>
               <w:rFonts w:eastAsia="Times New Roman" w:cs="Times New Roman"/>
               <w:color w:val="000000"/>
@@ -2470,7 +2768,7 @@
             <w:autoSpaceDE w:val="0"/>
             <w:autoSpaceDN w:val="0"/>
             <w:ind w:hanging="640"/>
-            <w:divId w:val="1673484134"/>
+            <w:divId w:val="519393723"/>
             <w:rPr>
               <w:rFonts w:eastAsia="Times New Roman" w:cs="Times New Roman"/>
               <w:color w:val="000000"/>
@@ -2497,7 +2795,7 @@
             <w:autoSpaceDE w:val="0"/>
             <w:autoSpaceDN w:val="0"/>
             <w:ind w:hanging="640"/>
-            <w:divId w:val="675614219"/>
+            <w:divId w:val="1139687458"/>
             <w:rPr>
               <w:rFonts w:eastAsia="Times New Roman" w:cs="Times New Roman"/>
               <w:color w:val="000000"/>
@@ -2516,7 +2814,7 @@
               <w:color w:val="000000"/>
             </w:rPr>
             <w:tab/>
-            <w:t xml:space="preserve">A. I. Rizmayanti, N. Hidayati, F. S. Nugraha, and W. Gata, “PENERAPAN DATA MINING UNTUK MEMPREDIKSI KOMPETENSI SISWA MENGGUNAKAN METODE DECISSION TREE ( STUDI KASUS SMK MULTICOMP DEPOK ),” </w:t>
+            <w:t xml:space="preserve">J. Homepage </w:t>
           </w:r>
           <w:r>
             <w:rPr>
@@ -2525,14 +2823,14 @@
               <w:iCs/>
               <w:color w:val="000000"/>
             </w:rPr>
-            <w:t>JURNAL SWABUMI</w:t>
+            <w:t>et al.</w:t>
           </w:r>
           <w:r>
             <w:rPr>
               <w:rFonts w:eastAsia="Times New Roman" w:cs="Times New Roman"/>
               <w:color w:val="000000"/>
             </w:rPr>
-            <w:t>, vol. 9, no. 1, p. 2021, 2021.</w:t>
+            <w:t>, “MALCOM: Indonesian Journal of Machine Learning and Computer Science Implementation of Decision Tree Algorithm and Support Vector Machine for Lung Cancer Classification Implementasi Algoritma Decision Tree dan Support Vector Machine untuk Klasifikasi Penyakit Kanker Paru,” vol. 3, pp. 15–19, 2023.</w:t>
           </w:r>
         </w:p>
         <w:p>
@@ -2540,7 +2838,7 @@
             <w:autoSpaceDE w:val="0"/>
             <w:autoSpaceDN w:val="0"/>
             <w:ind w:hanging="640"/>
-            <w:divId w:val="1750466699"/>
+            <w:divId w:val="682784724"/>
             <w:rPr>
               <w:rFonts w:eastAsia="Times New Roman" w:cs="Times New Roman"/>
               <w:color w:val="000000"/>
@@ -2559,15 +2857,7 @@
               <w:color w:val="000000"/>
             </w:rPr>
             <w:tab/>
-            <w:t xml:space="preserve">A. S. Fauzan, A. Irma, P. Sari, and I. Ali, “ANALISIS PERBANDINGAN ALGORITMA DECISIOIN TREE DAN NAÏVE UNTUK </w:t>
-          </w:r>
-          <w:r>
-            <w:rPr>
-              <w:rFonts w:eastAsia="Times New Roman" w:cs="Times New Roman"/>
-              <w:color w:val="000000"/>
-            </w:rPr>
-            <w:lastRenderedPageBreak/>
-            <w:t>MENGEVALUASI PRESTASI BELAJAR SISWA STUDI KASUS: SMK AL-MUSYAWIRIN,” 2024.</w:t>
+            <w:t>I. Habib Kusuma and N. Cahyono, “Analisis Sentimen Masyarakat Terhadap Penggunaan E-Commerce Menggunakan Algoritma K-Nearest Neighbor,” vol. 8, no. 3, 2023.</w:t>
           </w:r>
         </w:p>
         <w:p>
@@ -2575,7 +2865,7 @@
             <w:autoSpaceDE w:val="0"/>
             <w:autoSpaceDN w:val="0"/>
             <w:ind w:hanging="640"/>
-            <w:divId w:val="408162893"/>
+            <w:divId w:val="2060352350"/>
             <w:rPr>
               <w:rFonts w:eastAsia="Times New Roman" w:cs="Times New Roman"/>
               <w:color w:val="000000"/>
@@ -2586,7 +2876,35 @@
               <w:rFonts w:eastAsia="Times New Roman" w:cs="Times New Roman"/>
               <w:color w:val="000000"/>
             </w:rPr>
+            <w:lastRenderedPageBreak/>
             <w:t>[7]</w:t>
+          </w:r>
+          <w:r>
+            <w:rPr>
+              <w:rFonts w:eastAsia="Times New Roman" w:cs="Times New Roman"/>
+              <w:color w:val="000000"/>
+            </w:rPr>
+            <w:tab/>
+            <w:t>A. S. Fauzan, A. Irma, P. Sari, and I. Ali, “ANALISIS PERBANDINGAN ALGORITMA DECISIOIN TREE DAN NAÏVE UNTUK MENGEVALUASI PRESTASI BELAJAR SISWA STUDI KASUS: SMK AL-MUSYAWIRIN,” 2024.</w:t>
+          </w:r>
+        </w:p>
+        <w:p>
+          <w:pPr>
+            <w:autoSpaceDE w:val="0"/>
+            <w:autoSpaceDN w:val="0"/>
+            <w:ind w:hanging="640"/>
+            <w:divId w:val="1978027393"/>
+            <w:rPr>
+              <w:rFonts w:eastAsia="Times New Roman" w:cs="Times New Roman"/>
+              <w:color w:val="000000"/>
+            </w:rPr>
+          </w:pPr>
+          <w:r>
+            <w:rPr>
+              <w:rFonts w:eastAsia="Times New Roman" w:cs="Times New Roman"/>
+              <w:color w:val="000000"/>
+            </w:rPr>
+            <w:t>[8]</w:t>
           </w:r>
           <w:r>
             <w:rPr>
@@ -2618,7 +2936,7 @@
             <w:autoSpaceDE w:val="0"/>
             <w:autoSpaceDN w:val="0"/>
             <w:ind w:hanging="640"/>
-            <w:divId w:val="1641573050"/>
+            <w:divId w:val="536506748"/>
             <w:rPr>
               <w:rFonts w:eastAsia="Times New Roman" w:cs="Times New Roman"/>
               <w:color w:val="000000"/>
@@ -2629,7 +2947,7 @@
               <w:rFonts w:eastAsia="Times New Roman" w:cs="Times New Roman"/>
               <w:color w:val="000000"/>
             </w:rPr>
-            <w:t>[8]</w:t>
+            <w:t>[9]</w:t>
           </w:r>
           <w:r>
             <w:rPr>
@@ -2661,7 +2979,7 @@
             <w:autoSpaceDE w:val="0"/>
             <w:autoSpaceDN w:val="0"/>
             <w:ind w:hanging="640"/>
-            <w:divId w:val="65806930"/>
+            <w:divId w:val="906692613"/>
             <w:rPr>
               <w:rFonts w:eastAsia="Times New Roman" w:cs="Times New Roman"/>
               <w:color w:val="000000"/>
@@ -2672,7 +2990,7 @@
               <w:rFonts w:eastAsia="Times New Roman" w:cs="Times New Roman"/>
               <w:color w:val="000000"/>
             </w:rPr>
-            <w:t>[9]</w:t>
+            <w:t>[10]</w:t>
           </w:r>
           <w:r>
             <w:rPr>
@@ -2704,7 +3022,7 @@
             <w:autoSpaceDE w:val="0"/>
             <w:autoSpaceDN w:val="0"/>
             <w:ind w:hanging="640"/>
-            <w:divId w:val="1634752701"/>
+            <w:divId w:val="701370210"/>
             <w:rPr>
               <w:rFonts w:eastAsia="Times New Roman" w:cs="Times New Roman"/>
               <w:color w:val="000000"/>
@@ -2715,7 +3033,7 @@
               <w:rFonts w:eastAsia="Times New Roman" w:cs="Times New Roman"/>
               <w:color w:val="000000"/>
             </w:rPr>
-            <w:t>[10]</w:t>
+            <w:t>[11]</w:t>
           </w:r>
           <w:r>
             <w:rPr>
@@ -4759,8 +5077,11 @@
   <w:rsids>
     <w:rsidRoot w:val="00A7314B"/>
     <w:rsid w:val="004D556C"/>
+    <w:rsid w:val="006B1B31"/>
+    <w:rsid w:val="00821419"/>
     <w:rsid w:val="009F5771"/>
     <w:rsid w:val="00A7314B"/>
+    <w:rsid w:val="00FE757B"/>
   </w:rsids>
   <m:mathPr>
     <m:mathFont m:val="Cambria Math"/>
@@ -5528,7 +5849,7 @@
 
 <file path=word/webextensions/taskpanes.xml><?xml version="1.0" encoding="utf-8"?>
 <wetp:taskpanes xmlns:wetp="http://schemas.microsoft.com/office/webextensions/taskpanes/2010/11">
-  <wetp:taskpane dockstate="right" visibility="0" width="350" row="0">
+  <wetp:taskpane dockstate="right" visibility="0" width="438" row="0">
     <wetp:webextensionref xmlns:r="http://schemas.openxmlformats.org/officeDocument/2006/relationships" r:id="rId1"/>
   </wetp:taskpane>
 </wetp:taskpanes>
@@ -5542,8 +5863,8 @@
   </we:alternateReferences>
   <we:properties>
     <we:property name="MENDELEY_BIBLIOGRAPHY_IS_DIRTY" value="false"/>
-    <we:property name="MENDELEY_BIBLIOGRAPHY_LAST_MODIFIED" value="1779761875604"/>
-    <we:property name="MENDELEY_CITATIONS" value="[{&quot;citationID&quot;:&quot;MENDELEY_CITATION_5f80d213-6a32-438b-9bed-86a91f573acb&quot;,&quot;properties&quot;:{&quot;noteIndex&quot;:0},&quot;isEdited&quot;:false,&quot;manualOverride&quot;:{&quot;isManuallyOverridden&quot;:false,&quot;citeprocText&quot;:&quot;[1]&quot;,&quot;manualOverrideText&quot;:&quot;&quot;},&quot;citationTag&quot;:&quot;MENDELEY_CITATION_v3_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&quot;,&quot;citationItems&quot;:[{&quot;id&quot;:&quot;180b6a88-a5c9-3360-8604-eb32c9080bf4&quot;,&quot;itemData&quot;:{&quot;type&quot;:&quot;article-journal&quot;,&quot;id&quot;:&quot;180b6a88-a5c9-3360-8604-eb32c9080bf4&quot;,&quot;title&quot;:&quot;TINJAUAN PUSTAKA SISTEMATIS: PREDIKSI PRESTASI BELAJAR PESERTA DIDIK DENGAN ALGORITMA PEMBELAJARAN MESIN&quot;,&quot;author&quot;:[{&quot;family&quot;:&quot;Rajagukguk&quot;,&quot;given&quot;:&quot;Sabar Aritonang&quot;,&quot;parse-names&quot;:false,&quot;dropping-particle&quot;:&quot;&quot;,&quot;non-dropping-particle&quot;:&quot;&quot;}],&quot;container-title&quot;:&quot;Jurnal Sains, Nalar, dan Aplikasi Teknologi Informasi&quot;,&quot;DOI&quot;:&quot;10.20885/snati.v1i1.4&quot;,&quot;issued&quot;:{&quot;date-parts&quot;:[[2021,8,19]]},&quot;abstract&quot;:&quot;Penggunaan data profil dan capaian pemelajaran peserta didik dengan pembelajaran mesin untuk memprediksi prestasi belajar peserta didik akan memberi kontribusi penting bagi penyusunan strategi yang tepat dalam peningkatan prestasi belajar. Artikel ini menampilkan tinjauan pustaka sistematis (systematic literature review) terhadap 15 artikel penelitian yang mengimplementasikan algoritma pembelajaran mesin untuk memprediksi prestasi belajar peserta didik. Hasilnya adalah pembelajaran mesin relevan digunakan dalam memprediksi prestasi belajar peserta didik; sementara empat algoritma yang paling sering digunakan untuk memprediksi prestasi belajar peserta didik adalah ANN, Naïve Bayes, Logistic Regression, SVM dan Decision Tree. Temuan lain adalah bahwa pemangku kepentingan yang paling mendapat manfaat dari penelitian sejenis adalah lembaga pendidikan, dan jenis algoritma pembelajaran mesin yang paling banyak digunakan adalah jenis algoritma untuk klasifikasi.&quot;,&quot;publisher&quot;:&quot;Universitas Islam Indonesia (Islamic University of Indonesia)&quot;,&quot;issue&quot;:&quot;1&quot;,&quot;volume&quot;:&quot;1&quot;,&quot;container-title-short&quot;:&quot;&quot;},&quot;isTemporary&quot;:false}]},{&quot;citationID&quot;:&quot;MENDELEY_CITATION_1a2d5bc0-7939-47cc-8685-26c3bf85ef8c&quot;,&quot;properties&quot;:{&quot;noteIndex&quot;:0},&quot;isEdited&quot;:false,&quot;manualOverride&quot;:{&quot;isManuallyOverridden&quot;:false,&quot;citeprocText&quot;:&quot;[2]&quot;,&quot;manualOverrideText&quot;:&quot;&quot;},&quot;citationTag&quot;:&quot;MENDELEY_CITATION_v3_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&quot;,&quot;citationItems&quot;:[{&quot;id&quot;:&quot;3446447f-412f-3d3c-a6bf-365a527b067c&quot;,&quot;itemData&quot;:{&quot;type&quot;:&quot;report&quot;,&quot;id&quot;:&quot;3446447f-412f-3d3c-a6bf-365a527b067c&quot;,&quot;title&quot;:&quot;IJCIT (Indonesian Journal on Computer and Information Technology) Implementasi Algoritma Klasifikasi K-Nearest Neighbor (KNN) Untuk Klasifikasi Seleksi Penerima Beasiswa&quot;,&quot;author&quot;:[{&quot;family&quot;:&quot;Homepage&quot;,&quot;given&quot;:&quot;Journal&quot;,&quot;parse-names&quot;:false,&quot;dropping-particle&quot;:&quot;&quot;,&quot;non-dropping-particle&quot;:&quot;&quot;},{&quot;family&quot;:&quot;Cholil&quot;,&quot;given&quot;:&quot;Saifur Rohman&quot;,&quot;parse-names&quot;:false,&quot;dropping-particle&quot;:&quot;&quot;,&quot;non-dropping-particle&quot;:&quot;&quot;},{&quot;family&quot;:&quot;Handayani&quot;,&quot;given&quot;:&quot;Titis&quot;,&quot;parse-names&quot;:false,&quot;dropping-particle&quot;:&quot;&quot;,&quot;non-dropping-particle&quot;:&quot;&quot;},{&quot;family&quot;:&quot;Prathivi&quot;,&quot;given&quot;:&quot;Rastri&quot;,&quot;parse-names&quot;:false,&quot;dropping-particle&quot;:&quot;&quot;,&quot;non-dropping-particle&quot;:&quot;&quot;},{&quot;family&quot;:&quot;Ardianita&quot;,&quot;given&quot;:&quot;Tria&quot;,&quot;parse-names&quot;:false,&quot;dropping-particle&quot;:&quot;&quot;,&quot;non-dropping-particle&quot;:&quot;&quot;}],&quot;container-title&quot;:&quot;IJCIT (Indonesian Journal on Computer and Information Technology)&quot;,&quot;issued&quot;:{&quot;date-parts&quot;:[[2021]]},&quot;number-of-pages&quot;:&quot;118-127&quot;,&quot;abstract&quot;:&quot;Jurnal ini dapat diakses secara terbuka dan memiliki lisensi CC-BY-SA (https://creativecommons.org/licenses/by-sa/4.0/)&quot;,&quot;issue&quot;:&quot;2&quot;,&quot;volume&quot;:&quot;6&quot;,&quot;container-title-short&quot;:&quot;&quot;},&quot;isTemporary&quot;:false}]},{&quot;citationID&quot;:&quot;MENDELEY_CITATION_5ec4ad9c-e7ce-4a56-b3aa-87bebdcf3f63&quot;,&quot;properties&quot;:{&quot;noteIndex&quot;:0},&quot;isEdited&quot;:false,&quot;manualOverride&quot;:{&quot;isManuallyOverridden&quot;:false,&quot;citeprocText&quot;:&quot;[3]&quot;,&quot;manualOverrideText&quot;:&quot;&quot;},&quot;citationTag&quot;:&quot;MENDELEY_CITATION_v3_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&quot;,&quot;citationItems&quot;:[{&quot;id&quot;:&quot;44ead8d1-f939-36e5-a35c-af2bfd7d82d2&quot;,&quot;itemData&quot;:{&quot;type&quot;:&quot;article-journal&quot;,&quot;id&quot;:&quot;44ead8d1-f939-36e5-a35c-af2bfd7d82d2&quot;,&quot;title&quot;:&quot;Penggunaan Algoritma K-Nearest Neighbor (KNN) Untuk Mendeteksi Stunting Pada Anak&quot;,&quot;author&quot;:[{&quot;family&quot;:&quot;Situmeang&quot;,&quot;given&quot;:&quot;Natalia&quot;,&quot;parse-names&quot;:false,&quot;dropping-particle&quot;:&quot;&quot;,&quot;non-dropping-particle&quot;:&quot;&quot;},{&quot;family&quot;:&quot;Artamezia Komarsyah&quot;,&quot;given&quot;:&quot;Eliena&quot;,&quot;parse-names&quot;:false,&quot;dropping-particle&quot;:&quot;&quot;,&quot;non-dropping-particle&quot;:&quot;&quot;},{&quot;family&quot;:&quot;Fauzi&quot;,&quot;given&quot;:&quot;Ahmad&quot;,&quot;parse-names&quot;:false,&quot;dropping-particle&quot;:&quot;&quot;,&quot;non-dropping-particle&quot;:&quot;&quot;},{&quot;family&quot;:&quot;Sagala&quot;,&quot;given&quot;:&quot;Jepri&quot;,&quot;parse-names&quot;:false,&quot;dropping-particle&quot;:&quot;&quot;,&quot;non-dropping-particle&quot;:&quot;&quot;}],&quot;container-title&quot;:&quot;Jepri Sagala INNOVATIVE: Journal Of Social Science Research&quot;,&quot;ISSN&quot;:&quot;2807-4246&quot;,&quot;issued&quot;:{&quot;date-parts&quot;:[[2024]]},&quot;page&quot;:&quot;8401-8417&quot;,&quot;volume&quot;:&quot;5&quot;,&quot;container-title-short&quot;:&quot;&quot;},&quot;isTemporary&quot;:false}]},{&quot;citationID&quot;:&quot;MENDELEY_CITATION_e4b9b07c-4f20-4e3a-b016-7087b59d701c&quot;,&quot;properties&quot;:{&quot;noteIndex&quot;:0},&quot;isEdited&quot;:false,&quot;manualOverride&quot;:{&quot;isManuallyOverridden&quot;:false,&quot;citeprocText&quot;:&quot;[4]&quot;,&quot;manualOverrideText&quot;:&quot;&quot;},&quot;citationTag&quot;:&quot;MENDELEY_CITATION_v3_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&quot;,&quot;citationItems&quot;:[{&quot;id&quot;:&quot;0a2fa567-d44d-391d-bfd8-777eb3076c2e&quot;,&quot;itemData&quot;:{&quot;type&quot;:&quot;report&quot;,&quot;id&quot;:&quot;0a2fa567-d44d-391d-bfd8-777eb3076c2e&quot;,&quot;title&quot;:&quot;PENERAPAN ALGORITMA K-NEAREST NEIGHBOR (KNN) DALAM KLASIFIKASI PENILAIAN JAWABAN UJISAN ESAI&quot;,&quot;author&quot;:[{&quot;family&quot;:&quot;Mubarok&quot;,&quot;given&quot;:&quot;Muhammad Iqbal&quot;,&quot;parse-names&quot;:false,&quot;dropping-particle&quot;:&quot;&quot;,&quot;non-dropping-particle&quot;:&quot;&quot;},{&quot;family&quot;:&quot;Informatika&quot;,&quot;given&quot;:&quot;Carudin&quot;,&quot;parse-names&quot;:false,&quot;dropping-particle&quot;:&quot;&quot;,&quot;non-dropping-particle&quot;:&quot;&quot;},{&quot;family&quot;:&quot;Karawang&quot;,&quot;given&quot;:&quot;Singaperbangsa&quot;,&quot;parse-names&quot;:false,&quot;dropping-particle&quot;:&quot;&quot;,&quot;non-dropping-particle&quot;:&quot;&quot;},{&quot;family&quot;:&quot;Ronggo Waluyo&quot;,&quot;given&quot;:&quot;Jl Hs&quot;,&quot;parse-names&quot;:false,&quot;dropping-particle&quot;:&quot;&quot;,&quot;non-dropping-particle&quot;:&quot;&quot;},{&quot;family&quot;:&quot;Timur&quot;,&quot;given&quot;:&quot;Telukjambe&quot;,&quot;parse-names&quot;:false,&quot;dropping-particle&quot;:&quot;&quot;,&quot;non-dropping-particle&quot;:&quot;&quot;},{&quot;family&quot;:&quot;Karawang&quot;,&quot;given&quot;:&quot;Indonesia&quot;,&quot;parse-names&quot;:false,&quot;dropping-particle&quot;:&quot;&quot;,&quot;non-dropping-particle&quot;:&quot;&quot;}],&quot;container-title&quot;:&quot;Jurnal Mahasiswa Teknik Informatika&quot;,&quot;issued&quot;:{&quot;date-parts&quot;:[[2023]]},&quot;issue&quot;:&quot;5&quot;,&quot;volume&quot;:&quot;7&quot;},&quot;isTemporary&quot;:false}]},{&quot;citationID&quot;:&quot;MENDELEY_CITATION_855c249c-d11e-4be2-806b-89e2fa29adb0&quot;,&quot;properties&quot;:{&quot;noteIndex&quot;:0},&quot;isEdited&quot;:false,&quot;manualOverride&quot;:{&quot;isManuallyOverridden&quot;:false,&quot;citeprocText&quot;:&quot;[5]&quot;,&quot;manualOverrideText&quot;:&quot;&quot;},&quot;citationTag&quot;:&quot;MENDELEY_CITATION_v3_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&quot;,&quot;citationItems&quot;:[{&quot;id&quot;:&quot;8943aca8-efb5-3b37-8255-67ddfb3065b1&quot;,&quot;itemData&quot;:{&quot;type&quot;:&quot;article-journal&quot;,&quot;id&quot;:&quot;8943aca8-efb5-3b37-8255-67ddfb3065b1&quot;,&quot;title&quot;:&quot;PENERAPAN DATA MINING UNTUK MEMPREDIKSI\nKOMPETENSI SISWA MENGGUNAKAN METODE\nDECISSION TREE\n( STUDI KASUS SMK MULTICOMP DEPOK )&quot;,&quot;author&quot;:[{&quot;family&quot;:&quot;Rizmayanti&quot;,&quot;given&quot;:&quot;Ade Irma&quot;,&quot;parse-names&quot;:false,&quot;dropping-particle&quot;:&quot;&quot;,&quot;non-dropping-particle&quot;:&quot;&quot;},{&quot;family&quot;:&quot;Hidayati&quot;,&quot;given&quot;:&quot;Nadiyah&quot;,&quot;parse-names&quot;:false,&quot;dropping-particle&quot;:&quot;&quot;,&quot;non-dropping-particle&quot;:&quot;&quot;},{&quot;family&quot;:&quot;Nugraha&quot;,&quot;given&quot;:&quot;Fitra Septia&quot;,&quot;parse-names&quot;:false,&quot;dropping-particle&quot;:&quot;&quot;,&quot;non-dropping-particle&quot;:&quot;&quot;},{&quot;family&quot;:&quot;Gata&quot;,&quot;given&quot;:&quot;Windu&quot;,&quot;parse-names&quot;:false,&quot;dropping-particle&quot;:&quot;&quot;,&quot;non-dropping-particle&quot;:&quot;&quot;}],&quot;container-title&quot;:&quot;JURNAL SWABUMI&quot;,&quot;ISSN&quot;:&quot;2549-5178&quot;,&quot;issued&quot;:{&quot;date-parts&quot;:[[2021]]},&quot;page&quot;:&quot;2021&quot;,&quot;abstract&quot;:&quot;This study discusses the application of data mining to predict student competencies using the decision tree method. In this study applying data mining to predict student competency using the decision tree method. This research was conducted to predict student learning outcomes based on report card grades semester 1, semester 2 semester 3 and semester 4. Data were then managed using Rapid Miner to facilitate predicting student competencies. The study was conducted at Multicomp SMK which has 3 majors namely Hospitality Accommodation, Online Business and Marketing and Multimedia. Research using data from students in each department includes class X and class XI. The application of data mining is used to predict student competencies by using a decision tree and C 4.5 algorithm as a support as well as a comparison to determine the competency of students of Multicomp Depok Vocational School based on both methods. This method is able to measure the ability of students appropriately and be able to provide an understanding at a certain level according to the needs of Indonesian education has a pattern and learning strategy based on students' reasoning abilities. Students are expected to be able to analyze a problem well and find the right solution. students are not accompanied by an adequate education system or curriculum. Teacher competencies that are not evenly distributed in various schools and governments are felt to be very lacking in realizing reasoning based education systems.&quot;,&quot;issue&quot;:&quot;1&quot;,&quot;volume&quot;:&quot;9&quot;},&quot;isTemporary&quot;:false}]},{&quot;citationID&quot;:&quot;MENDELEY_CITATION_51359faf-bd55-49a4-8bbf-e54e8d456697&quot;,&quot;properties&quot;:{&quot;noteIndex&quot;:0},&quot;isEdited&quot;:false,&quot;manualOverride&quot;:{&quot;isManuallyOverridden&quot;:false,&quot;citeprocText&quot;:&quot;[2]&quot;,&quot;manualOverrideText&quot;:&quot;&quot;},&quot;citationTag&quot;:&quot;MENDELEY_CITATION_v3_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&quot;,&quot;citationItems&quot;:[{&quot;id&quot;:&quot;3446447f-412f-3d3c-a6bf-365a527b067c&quot;,&quot;itemData&quot;:{&quot;type&quot;:&quot;report&quot;,&quot;id&quot;:&quot;3446447f-412f-3d3c-a6bf-365a527b067c&quot;,&quot;title&quot;:&quot;IJCIT (Indonesian Journal on Computer and Information Technology) Implementasi Algoritma Klasifikasi K-Nearest Neighbor (KNN) Untuk Klasifikasi Seleksi Penerima Beasiswa&quot;,&quot;author&quot;:[{&quot;family&quot;:&quot;Homepage&quot;,&quot;given&quot;:&quot;Journal&quot;,&quot;parse-names&quot;:false,&quot;dropping-particle&quot;:&quot;&quot;,&quot;non-dropping-particle&quot;:&quot;&quot;},{&quot;family&quot;:&quot;Cholil&quot;,&quot;given&quot;:&quot;Saifur Rohman&quot;,&quot;parse-names&quot;:false,&quot;dropping-particle&quot;:&quot;&quot;,&quot;non-dropping-particle&quot;:&quot;&quot;},{&quot;family&quot;:&quot;Handayani&quot;,&quot;given&quot;:&quot;Titis&quot;,&quot;parse-names&quot;:false,&quot;dropping-particle&quot;:&quot;&quot;,&quot;non-dropping-particle&quot;:&quot;&quot;},{&quot;family&quot;:&quot;Prathivi&quot;,&quot;given&quot;:&quot;Rastri&quot;,&quot;parse-names&quot;:false,&quot;dropping-particle&quot;:&quot;&quot;,&quot;non-dropping-particle&quot;:&quot;&quot;},{&quot;family&quot;:&quot;Ardianita&quot;,&quot;given&quot;:&quot;Tria&quot;,&quot;parse-names&quot;:false,&quot;dropping-particle&quot;:&quot;&quot;,&quot;non-dropping-particle&quot;:&quot;&quot;}],&quot;container-title&quot;:&quot;IJCIT (Indonesian Journal on Computer and Information Technology)&quot;,&quot;issued&quot;:{&quot;date-parts&quot;:[[2021]]},&quot;number-of-pages&quot;:&quot;118-127&quot;,&quot;abstract&quot;:&quot;Jurnal ini dapat diakses secara terbuka dan memiliki lisensi CC-BY-SA (https://creativecommons.org/licenses/by-sa/4.0/)&quot;,&quot;issue&quot;:&quot;2&quot;,&quot;volume&quot;:&quot;6&quot;,&quot;container-title-short&quot;:&quot;&quot;},&quot;isTemporary&quot;:false}]},{&quot;citationID&quot;:&quot;MENDELEY_CITATION_fd52ea47-ab08-4839-9a93-e9759ec4e0d4&quot;,&quot;properties&quot;:{&quot;noteIndex&quot;:0},&quot;isEdited&quot;:false,&quot;manualOverride&quot;:{&quot;isManuallyOverridden&quot;:false,&quot;citeprocText&quot;:&quot;[5]&quot;,&quot;manualOverrideText&quot;:&quot;&quot;},&quot;citationTag&quot;:&quot;MENDELEY_CITATION_v3_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&quot;,&quot;citationItems&quot;:[{&quot;id&quot;:&quot;8943aca8-efb5-3b37-8255-67ddfb3065b1&quot;,&quot;itemData&quot;:{&quot;type&quot;:&quot;article-journal&quot;,&quot;id&quot;:&quot;8943aca8-efb5-3b37-8255-67ddfb3065b1&quot;,&quot;title&quot;:&quot;PENERAPAN DATA MINING UNTUK MEMPREDIKSI\nKOMPETENSI SISWA MENGGUNAKAN METODE\nDECISSION TREE\n( STUDI KASUS SMK MULTICOMP DEPOK )&quot;,&quot;author&quot;:[{&quot;family&quot;:&quot;Rizmayanti&quot;,&quot;given&quot;:&quot;Ade Irma&quot;,&quot;parse-names&quot;:false,&quot;dropping-particle&quot;:&quot;&quot;,&quot;non-dropping-particle&quot;:&quot;&quot;},{&quot;family&quot;:&quot;Hidayati&quot;,&quot;given&quot;:&quot;Nadiyah&quot;,&quot;parse-names&quot;:false,&quot;dropping-particle&quot;:&quot;&quot;,&quot;non-dropping-particle&quot;:&quot;&quot;},{&quot;family&quot;:&quot;Nugraha&quot;,&quot;given&quot;:&quot;Fitra Septia&quot;,&quot;parse-names&quot;:false,&quot;dropping-particle&quot;:&quot;&quot;,&quot;non-dropping-particle&quot;:&quot;&quot;},{&quot;family&quot;:&quot;Gata&quot;,&quot;given&quot;:&quot;Windu&quot;,&quot;parse-names&quot;:false,&quot;dropping-particle&quot;:&quot;&quot;,&quot;non-dropping-particle&quot;:&quot;&quot;}],&quot;container-title&quot;:&quot;JURNAL SWABUMI&quot;,&quot;ISSN&quot;:&quot;2549-5178&quot;,&quot;issued&quot;:{&quot;date-parts&quot;:[[2021]]},&quot;page&quot;:&quot;2021&quot;,&quot;abstract&quot;:&quot;This study discusses the application of data mining to predict student competencies using the decision tree method. In this study applying data mining to predict student competency using the decision tree method. This research was conducted to predict student learning outcomes based on report card grades semester 1, semester 2 semester 3 and semester 4. Data were then managed using Rapid Miner to facilitate predicting student competencies. The study was conducted at Multicomp SMK which has 3 majors namely Hospitality Accommodation, Online Business and Marketing and Multimedia. Research using data from students in each department includes class X and class XI. The application of data mining is used to predict student competencies by using a decision tree and C 4.5 algorithm as a support as well as a comparison to determine the competency of students of Multicomp Depok Vocational School based on both methods. This method is able to measure the ability of students appropriately and be able to provide an understanding at a certain level according to the needs of Indonesian education has a pattern and learning strategy based on students' reasoning abilities. Students are expected to be able to analyze a problem well and find the right solution. students are not accompanied by an adequate education system or curriculum. Teacher competencies that are not evenly distributed in various schools and governments are felt to be very lacking in realizing reasoning based education systems.&quot;,&quot;issue&quot;:&quot;1&quot;,&quot;volume&quot;:&quot;9&quot;,&quot;container-title-short&quot;:&quot;&quot;},&quot;isTemporary&quot;:false}]},{&quot;citationID&quot;:&quot;MENDELEY_CITATION_056d18f0-790c-4def-af03-d5baa5309659&quot;,&quot;properties&quot;:{&quot;noteIndex&quot;:0},&quot;isEdited&quot;:false,&quot;manualOverride&quot;:{&quot;isManuallyOverridden&quot;:false,&quot;citeprocText&quot;:&quot;[6]&quot;,&quot;manualOverrideText&quot;:&quot;&quot;},&quot;citationTag&quot;:&quot;MENDELEY_CITATION_v3_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&quot;,&quot;citationItems&quot;:[{&quot;id&quot;:&quot;8ae1f53c-ab45-3874-828d-80de4856364a&quot;,&quot;itemData&quot;:{&quot;type&quot;:&quot;report&quot;,&quot;id&quot;:&quot;8ae1f53c-ab45-3874-828d-80de4856364a&quot;,&quot;title&quot;:&quot;ANALISIS PERBANDINGAN ALGORITMA DECISIOIN TREE DAN NAÏVE UNTUK MENGEVALUASI PRESTASI BELAJAR SISWA STUDI KASUS: SMK AL-MUSYAWIRIN&quot;,&quot;author&quot;:[{&quot;family&quot;:&quot;Fauzan&quot;,&quot;given&quot;:&quot;Aldi Sholihin&quot;,&quot;parse-names&quot;:false,&quot;dropping-particle&quot;:&quot;&quot;,&quot;non-dropping-particle&quot;:&quot;&quot;},{&quot;family&quot;:&quot;Irma&quot;,&quot;given&quot;:&quot;Ade&quot;,&quot;parse-names&quot;:false,&quot;dropping-particle&quot;:&quot;&quot;,&quot;non-dropping-particle&quot;:&quot;&quot;},{&quot;family&quot;:&quot;Sari&quot;,&quot;given&quot;:&quot;Purnama&quot;,&quot;parse-names&quot;:false,&quot;dropping-particle&quot;:&quot;&quot;,&quot;non-dropping-particle&quot;:&quot;&quot;},{&quot;family&quot;:&quot;Ali&quot;,&quot;given&quot;:&quot;Irfan&quot;,&quot;parse-names&quot;:false,&quot;dropping-particle&quot;:&quot;&quot;,&quot;non-dropping-particle&quot;:&quot;&quot;}],&quot;container-title&quot;:&quot;Jurnal Mahasiswa Teknik Informatika&quot;,&quot;issued&quot;:{&quot;date-parts&quot;:[[2024]]},&quot;issue&quot;:&quot;1&quot;,&quot;volume&quot;:&quot;8&quot;,&quot;container-title-short&quot;:&quot;&quot;},&quot;isTemporary&quot;:false}]},{&quot;citationID&quot;:&quot;MENDELEY_CITATION_bc98dd7b-12f4-427d-b7b0-4e3e431286c7&quot;,&quot;properties&quot;:{&quot;noteIndex&quot;:0},&quot;isEdited&quot;:false,&quot;manualOverride&quot;:{&quot;isManuallyOverridden&quot;:false,&quot;citeprocText&quot;:&quot;[6]&quot;,&quot;manualOverrideText&quot;:&quot;&quot;},&quot;citationTag&quot;:&quot;MENDELEY_CITATION_v3_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&quot;,&quot;citationItems&quot;:[{&quot;id&quot;:&quot;8ae1f53c-ab45-3874-828d-80de4856364a&quot;,&quot;itemData&quot;:{&quot;type&quot;:&quot;report&quot;,&quot;id&quot;:&quot;8ae1f53c-ab45-3874-828d-80de4856364a&quot;,&quot;title&quot;:&quot;ANALISIS PERBANDINGAN ALGORITMA DECISIOIN TREE DAN NAÏVE UNTUK MENGEVALUASI PRESTASI BELAJAR SISWA STUDI KASUS: SMK AL-MUSYAWIRIN&quot;,&quot;author&quot;:[{&quot;family&quot;:&quot;Fauzan&quot;,&quot;given&quot;:&quot;Aldi Sholihin&quot;,&quot;parse-names&quot;:false,&quot;dropping-particle&quot;:&quot;&quot;,&quot;non-dropping-particle&quot;:&quot;&quot;},{&quot;family&quot;:&quot;Irma&quot;,&quot;given&quot;:&quot;Ade&quot;,&quot;parse-names&quot;:false,&quot;dropping-particle&quot;:&quot;&quot;,&quot;non-dropping-particle&quot;:&quot;&quot;},{&quot;family&quot;:&quot;Sari&quot;,&quot;given&quot;:&quot;Purnama&quot;,&quot;parse-names&quot;:false,&quot;dropping-particle&quot;:&quot;&quot;,&quot;non-dropping-particle&quot;:&quot;&quot;},{&quot;family&quot;:&quot;Ali&quot;,&quot;given&quot;:&quot;Irfan&quot;,&quot;parse-names&quot;:false,&quot;dropping-particle&quot;:&quot;&quot;,&quot;non-dropping-particle&quot;:&quot;&quot;}],&quot;container-title&quot;:&quot;Jurnal Mahasiswa Teknik Informatika&quot;,&quot;issued&quot;:{&quot;date-parts&quot;:[[2024]]},&quot;issue&quot;:&quot;1&quot;,&quot;volume&quot;:&quot;8&quot;,&quot;container-title-short&quot;:&quot;&quot;},&quot;isTemporary&quot;:false}]},{&quot;citationID&quot;:&quot;MENDELEY_CITATION_a24887d4-9676-49e6-8762-0b3808ef033a&quot;,&quot;properties&quot;:{&quot;noteIndex&quot;:0},&quot;isEdited&quot;:false,&quot;manualOverride&quot;:{&quot;isManuallyOverridden&quot;:false,&quot;citeprocText&quot;:&quot;[7]&quot;,&quot;manualOverrideText&quot;:&quot;&quot;},&quot;citationTag&quot;:&quot;MENDELEY_CITATION_v3_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&quot;,&quot;citationItems&quot;:[{&quot;id&quot;:&quot;1aba658f-c481-3077-b7aa-192c8f4e08ff&quot;,&quot;itemData&quot;:{&quot;type&quot;:&quot;article-journal&quot;,&quot;id&quot;:&quot;1aba658f-c481-3077-b7aa-192c8f4e08ff&quot;,&quot;title&quot;:&quot;Perbandingan Algoritma Naïve Bayes dan K-Nearest Neighbor (KNN) untuk Mengetahui Keakuratan Diagnosa Penyakit Diabetes&quot;,&quot;author&quot;:[{&quot;family&quot;:&quot;Puteri&quot;,&quot;given&quot;:&quot;Qonitah Alia&quot;,&quot;parse-names&quot;:false,&quot;dropping-particle&quot;:&quot;&quot;,&quot;non-dropping-particle&quot;:&quot;&quot;},{&quot;family&quot;:&quot;Sagirani&quot;,&quot;given&quot;:&quot;Tri&quot;,&quot;parse-names&quot;:false,&quot;dropping-particle&quot;:&quot;&quot;,&quot;non-dropping-particle&quot;:&quot;&quot;},{&quot;family&quot;:&quot;Lemantara&quot;,&quot;given&quot;:&quot;Julianto&quot;,&quot;parse-names&quot;:false,&quot;dropping-particle&quot;:&quot;&quot;,&quot;non-dropping-particle&quot;:&quot;&quot;}],&quot;container-title&quot;:&quot;Jurnal Nasional Teknologi dan Sistem Informasi&quot;,&quot;DOI&quot;:&quot;10.25077/teknosi.v9i3.2023.247-254&quot;,&quot;ISSN&quot;:&quot;2460-3465&quot;,&quot;issued&quot;:{&quot;date-parts&quot;:[[2023,12,31]]},&quot;page&quot;:&quot;247-254&quot;,&quot;abstract&quot;:&quot;Diabetes adalah gangguan metabolisme kronis di mana pankreas tidak bisa menciptakan insulin yang cukup ataupun tubuh tidak berhasil menggunakan insulin yang telah dihasilkan. Penyebab yang dapat menimbulkan terjadinya penyakit diabetes berawal dari  banyak antara lain penyebab genetik dan lingkungan. Diabetes tidak hanya menyebabkan kerugian ekonomi bagi pasien karena biaya pengobatan tetapi juga memperpendek umur peluang untuk hidup sebesar 5 – 10 tahun. Akibat lainnya adalah jika  tidak ada upaya untuk mengontrol dan mencegah, diabetes dapat semakin memperburuk penderita karena dapat menimbulkan komplikasi yang berat. Berdasarkan permasalahan tersebut dapat dilakukan prediksi penyakit diabetes untuk  dapat membantu tenaga medis mengetahu lebih dini kondisi pasien. Algoritma Naive Bayes dan K-Nearest neighbor (KNN) bisa digunakan membantu prediksi  penyakit diabetes dengan menggunakan software RapidMiner Python. Hasil penelitian ini dievaluasi dengan Confusion Matrix serta Nilai AUC. Hasil metode Naïve Bayes adalah 77% dengan nilai AUC 0.83 sedangkan metode K-nearest neighbor (KNN=3) adalah 71% dengan nilai AUC 0.75, KNN=5 adalah 69% dengan AUC 0.76, dan KNN=7 adalah 68% dengan AUC 0.75 sehingga dapat disimpulkan bahwa algoritma naïve bayes lebih unggul dibandingkan dengan KNN, meski pada penelitian ini untuk algoritma KNN menggunakan K=3, K=5 dan K=7, lalu untuk untuk yang KNN dari ketiga K yang digunakan dari segi confusion matrix KNN=3 lebih unggul sedangkan dari nilai AUC yaitu KNN=5.&quot;,&quot;publisher&quot;:&quot;Universitas Andalas&quot;,&quot;issue&quot;:&quot;3&quot;,&quot;volume&quot;:&quot;9&quot;,&quot;container-title-short&quot;:&quot;&quot;},&quot;isTemporary&quot;:false}]},{&quot;citationID&quot;:&quot;MENDELEY_CITATION_a0039dc8-53a4-46e3-b5ed-0abab40a5708&quot;,&quot;properties&quot;:{&quot;noteIndex&quot;:0},&quot;isEdited&quot;:false,&quot;manualOverride&quot;:{&quot;isManuallyOverridden&quot;:false,&quot;citeprocText&quot;:&quot;[7]&quot;,&quot;manualOverrideText&quot;:&quot;&quot;},&quot;citationTag&quot;:&quot;MENDELEY_CITATION_v3_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&quot;,&quot;citationItems&quot;:[{&quot;id&quot;:&quot;1aba658f-c481-3077-b7aa-192c8f4e08ff&quot;,&quot;itemData&quot;:{&quot;type&quot;:&quot;article-journal&quot;,&quot;id&quot;:&quot;1aba658f-c481-3077-b7aa-192c8f4e08ff&quot;,&quot;title&quot;:&quot;Perbandingan Algoritma Naïve Bayes dan K-Nearest Neighbor (KNN) untuk Mengetahui Keakuratan Diagnosa Penyakit Diabetes&quot;,&quot;author&quot;:[{&quot;family&quot;:&quot;Puteri&quot;,&quot;given&quot;:&quot;Qonitah Alia&quot;,&quot;parse-names&quot;:false,&quot;dropping-particle&quot;:&quot;&quot;,&quot;non-dropping-particle&quot;:&quot;&quot;},{&quot;family&quot;:&quot;Sagirani&quot;,&quot;given&quot;:&quot;Tri&quot;,&quot;parse-names&quot;:false,&quot;dropping-particle&quot;:&quot;&quot;,&quot;non-dropping-particle&quot;:&quot;&quot;},{&quot;family&quot;:&quot;Lemantara&quot;,&quot;given&quot;:&quot;Julianto&quot;,&quot;parse-names&quot;:false,&quot;dropping-particle&quot;:&quot;&quot;,&quot;non-dropping-particle&quot;:&quot;&quot;}],&quot;container-title&quot;:&quot;Jurnal Nasional Teknologi dan Sistem Informasi&quot;,&quot;DOI&quot;:&quot;10.25077/teknosi.v9i3.2023.247-254&quot;,&quot;ISSN&quot;:&quot;2460-3465&quot;,&quot;issued&quot;:{&quot;date-parts&quot;:[[2023,12,31]]},&quot;page&quot;:&quot;247-254&quot;,&quot;abstract&quot;:&quot;Diabetes adalah gangguan metabolisme kronis di mana pankreas tidak bisa menciptakan insulin yang cukup ataupun tubuh tidak berhasil menggunakan insulin yang telah dihasilkan. Penyebab yang dapat menimbulkan terjadinya penyakit diabetes berawal dari  banyak antara lain penyebab genetik dan lingkungan. Diabetes tidak hanya menyebabkan kerugian ekonomi bagi pasien karena biaya pengobatan tetapi juga memperpendek umur peluang untuk hidup sebesar 5 – 10 tahun. Akibat lainnya adalah jika  tidak ada upaya untuk mengontrol dan mencegah, diabetes dapat semakin memperburuk penderita karena dapat menimbulkan komplikasi yang berat. Berdasarkan permasalahan tersebut dapat dilakukan prediksi penyakit diabetes untuk  dapat membantu tenaga medis mengetahu lebih dini kondisi pasien. Algoritma Naive Bayes dan K-Nearest neighbor (KNN) bisa digunakan membantu prediksi  penyakit diabetes dengan menggunakan software RapidMiner Python. Hasil penelitian ini dievaluasi dengan Confusion Matrix serta Nilai AUC. Hasil metode Naïve Bayes adalah 77% dengan nilai AUC 0.83 sedangkan metode K-nearest neighbor (KNN=3) adalah 71% dengan nilai AUC 0.75, KNN=5 adalah 69% dengan AUC 0.76, dan KNN=7 adalah 68% dengan AUC 0.75 sehingga dapat disimpulkan bahwa algoritma naïve bayes lebih unggul dibandingkan dengan KNN, meski pada penelitian ini untuk algoritma KNN menggunakan K=3, K=5 dan K=7, lalu untuk untuk yang KNN dari ketiga K yang digunakan dari segi confusion matrix KNN=3 lebih unggul sedangkan dari nilai AUC yaitu KNN=5.&quot;,&quot;publisher&quot;:&quot;Universitas Andalas&quot;,&quot;issue&quot;:&quot;3&quot;,&quot;volume&quot;:&quot;9&quot;,&quot;container-title-short&quot;:&quot;&quot;},&quot;isTemporary&quot;:false}]},{&quot;citationID&quot;:&quot;MENDELEY_CITATION_4f859785-31c9-4639-beb2-0f00949de98a&quot;,&quot;properties&quot;:{&quot;noteIndex&quot;:0},&quot;isEdited&quot;:false,&quot;manualOverride&quot;:{&quot;isManuallyOverridden&quot;:false,&quot;citeprocText&quot;:&quot;[8]&quot;,&quot;manualOverrideText&quot;:&quot;&quot;},&quot;citationTag&quot;:&quot;MENDELEY_CITATION_v3_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&quot;,&quot;citationItems&quot;:[{&quot;id&quot;:&quot;c611b54b-7c00-377d-994e-816a18561027&quot;,&quot;itemData&quot;:{&quot;type&quot;:&quot;article-journal&quot;,&quot;id&quot;:&quot;c611b54b-7c00-377d-994e-816a18561027&quot;,&quot;title&quot;:&quot;PENGARUH KOMPOSISI SPLIT DATA PADA AKURASI KLASIFIKASI PENDERITA DIABETES MENGGUNAKAN ALGORITMA MACHINE LEARNING&quot;,&quot;author&quot;:[{&quot;family&quot;:&quot;Refindha&quot;,&quot;given&quot;:&quot;Febby&quot;,&quot;parse-names&quot;:false,&quot;dropping-particle&quot;:&quot;&quot;,&quot;non-dropping-particle&quot;:&quot;&quot;},{&quot;family&quot;:&quot;Harianto&quot;,&quot;given&quot;:&quot;Aftha&quot;,&quot;parse-names&quot;:false,&quot;dropping-particle&quot;:&quot;&quot;,&quot;non-dropping-particle&quot;:&quot;&quot;},{&quot;family&quot;:&quot;Alawi&quot;,&quot;given&quot;:&quot;Zakki&quot;,&quot;parse-names&quot;:false,&quot;dropping-particle&quot;:&quot;&quot;,&quot;non-dropping-particle&quot;:&quot;&quot;},{&quot;family&quot;:&quot;Sa'ida&quot;,&quot;given&quot;:&quot;Ita Aristia&quot;,&quot;parse-names&quot;:false,&quot;dropping-particle&quot;:&quot;&quot;,&quot;non-dropping-particle&quot;:&quot;&quot;}],&quot;container-title&quot;:&quot;Jurnal Sistem Informasi dan Informatika (Simika)&quot;,&quot;ISSN&quot;:&quot;2622-6375&quot;,&quot;issued&quot;:{&quot;date-parts&quot;:[[2025]]},&quot;abstract&quot;:&quot;The increasing number of people with diabetes is an international health problem. To prevent diabetic complications, early diagnosis and accurate classification are essential. This study looks at how the composition of split data affects the classification performance of diabetics with machine learning algorithms such as Random Forest, Naive Bayes, and Support Vector Machine (SVM).&quot;,&quot;issue&quot;:&quot;1&quot;,&quot;volume&quot;:&quot;8&quot;,&quot;container-title-short&quot;:&quot;&quot;},&quot;isTemporary&quot;:false,&quot;suppress-author&quot;:false,&quot;composite&quot;:false,&quot;author-only&quot;:false}]},{&quot;citationID&quot;:&quot;MENDELEY_CITATION_ab32046d-6187-4f3d-a6d4-2708f285d141&quot;,&quot;properties&quot;:{&quot;noteIndex&quot;:0},&quot;isEdited&quot;:false,&quot;manualOverride&quot;:{&quot;isManuallyOverridden&quot;:false,&quot;citeprocText&quot;:&quot;[9]&quot;,&quot;manualOverrideText&quot;:&quot;&quot;},&quot;citationTag&quot;:&quot;MENDELEY_CITATION_v3_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&quot;,&quot;citationItems&quot;:[{&quot;id&quot;:&quot;594bdb54-c074-3867-beb1-dd4dd232b72c&quot;,&quot;itemData&quot;:{&quot;type&quot;:&quot;article-journal&quot;,&quot;id&quot;:&quot;594bdb54-c074-3867-beb1-dd4dd232b72c&quot;,&quot;title&quot;:&quot;Klasifikasi Kualitas Jambu Air Madu Deli Merah, Dengan Menerapkan Metode K-NN model Euclidean Distance&quot;,&quot;author&quot;:[{&quot;family&quot;:&quot;Kualitas&quot;,&quot;given&quot;:&quot;Klasifikasi&quot;,&quot;parse-names&quot;:false,&quot;dropping-particle&quot;:&quot;&quot;,&quot;non-dropping-particle&quot;:&quot;&quot;},{&quot;family&quot;:&quot;Air&quot;,&quot;given&quot;:&quot;Jambu&quot;,&quot;parse-names&quot;:false,&quot;dropping-particle&quot;:&quot;&quot;,&quot;non-dropping-particle&quot;:&quot;&quot;},{&quot;family&quot;:&quot;Merah&quot;,&quot;given&quot;:&quot;Madu Deli&quot;,&quot;parse-names&quot;:false,&quot;dropping-particle&quot;:&quot;&quot;,&quot;non-dropping-particle&quot;:&quot;&quot;},{&quot;family&quot;:&quot;Dengan&quot;,&quot;given&quot;:&quot;Menerapkan&quot;,&quot;parse-names&quot;:false,&quot;dropping-particle&quot;:&quot;&quot;,&quot;non-dropping-particle&quot;:&quot;&quot;},{&quot;family&quot;:&quot;Metode&quot;,&quot;given&quot;:&quot;K-Nn&quot;,&quot;parse-names&quot;:false,&quot;dropping-particle&quot;:&quot;&quot;,&quot;non-dropping-particle&quot;:&quot;&quot;},{&quot;family&quot;:&quot;Distance -Fadlan&quot;,&quot;given&quot;:&quot;Euclidean&quot;,&quot;parse-names&quot;:false,&quot;dropping-particle&quot;:&quot;&quot;,&quot;non-dropping-particle&quot;:&quot;&quot;},{&quot;family&quot;:&quot;Ramadhan&quot;,&quot;given&quot;:&quot;Zuhri&quot;,&quot;parse-names&quot;:false,&quot;dropping-particle&quot;:&quot;&quot;,&quot;non-dropping-particle&quot;:&quot;&quot;},{&quot;family&quot;:&quot;Ramadhan&quot;,&quot;given&quot;:&quot;Fadlan Zuhri&quot;,&quot;parse-names&quot;:false,&quot;dropping-particle&quot;:&quot;&quot;,&quot;non-dropping-particle&quot;:&quot;&quot;},{&quot;family&quot;:&quot;Aripin&quot;,&quot;given&quot;:&quot;Soeb&quot;,&quot;parse-names&quot;:false,&quot;dropping-particle&quot;:&quot;&quot;,&quot;non-dropping-particle&quot;:&quot;&quot;},{&quot;family&quot;:&quot;Ulfa&quot;,&quot;given&quot;:&quot;Kurnia&quot;,&quot;parse-names&quot;:false,&quot;dropping-particle&quot;:&quot;&quot;,&quot;non-dropping-particle&quot;:&quot;&quot;}],&quot;DOI&quot;:&quot;10.54209/jatilima.v7i05.1633&quot;,&quot;URL&quot;:&quot;https://journal.cattleyadf.org/index.php/jatilima/index&quot;,&quot;issued&quot;:{&quot;date-parts&quot;:[[2025]]},&quot;publisher&quot;:&quot;Online&quot;,&quot;volume&quot;:&quot;07&quot;,&quot;container-title-short&quot;:&quot;&quot;},&quot;isTemporary&quot;:false,&quot;suppress-author&quot;:false,&quot;composite&quot;:false,&quot;author-only&quot;:false}]},{&quot;citationID&quot;:&quot;MENDELEY_CITATION_671e1178-7df1-4f1d-ab6c-5b102c6271cd&quot;,&quot;properties&quot;:{&quot;noteIndex&quot;:0},&quot;isEdited&quot;:false,&quot;manualOverride&quot;:{&quot;isManuallyOverridden&quot;:false,&quot;citeprocText&quot;:&quot;[10]&quot;,&quot;manualOverrideText&quot;:&quot;&quot;},&quot;citationTag&quot;:&quot;MENDELEY_CITATION_v3_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&quot;,&quot;citationItems&quot;:[{&quot;id&quot;:&quot;4f180aef-3212-34f5-b147-dcd03967a16f&quot;,&quot;itemData&quot;:{&quot;type&quot;:&quot;article-journal&quot;,&quot;id&quot;:&quot;4f180aef-3212-34f5-b147-dcd03967a16f&quot;,&quot;title&quot;:&quot;Analisis Komparatif Algoritma Machine Learning dengan Metrik Akurasi, Presisi, Recall, dan F1-Score pada Dataset Kacang Kering&quot;,&quot;author&quot;:[{&quot;family&quot;:&quot;Helmiyah&quot;,&quot;given&quot;:&quot;Siti&quot;,&quot;parse-names&quot;:false,&quot;dropping-particle&quot;:&quot;&quot;,&quot;non-dropping-particle&quot;:&quot;&quot;},{&quot;family&quot;:&quot;Pramestiawan&quot;,&quot;given&quot;:&quot;Rico&quot;,&quot;parse-names&quot;:false,&quot;dropping-particle&quot;:&quot;&quot;,&quot;non-dropping-particle&quot;:&quot;&quot;}],&quot;container-title&quot;:&quot;Jurnal Ilmu Komputer dan Teknologi&quot;,&quot;DOI&quot;:&quot;10.35960/ikomti.v6i3.2031&quot;,&quot;ISSN&quot;:&quot;2746-4237&quot;,&quot;URL&quot;:&quot;https://ejournal.uhb.ac.id/index.php/IKOMTI/article/view/2031&quot;,&quot;issued&quot;:{&quot;date-parts&quot;:[[2025,10,30]]},&quot;page&quot;:&quot;152-159&quot;,&quot;abstract&quot;:&quot;&lt;p&gt;This study aims to compare the performance of five machine learning algorithms in classifying dry bean varieties as an effort to support quality detection systems for agricultural products. Issues related to authenticity and food safety that frequently occur, such as rice adulteration, highlight the importance of fast and accurate methods for variety identification. The study utilizes the Dry Bean Dataset from the UCI Machine Learning Repository, which consists of 13,611 samples with 16 numerical features and 7 classes of bean varieties. Five algorithms were tested, including K-Nearest Neighbors (KNN), Decision Tree (DT), Support Vector Machine (SVM), Random Forest (RF), and Logistic Regression (LR). The data were divided into 80% for training and 20% for testing, and evaluated using accuracy, precision, recall, and F1-Score metrics. The results show that the SVM algorithm achieved the best performance with an accuracy of 92.43% and an F1-Score of 93.61%, followed by Logistic Regression and Random Forest. The confusion matrix analysis indicates that most varieties were correctly classified, although some misclassifications occurred among classes with similar morphological characteristics such as Dermason, Seker, and Sira. Based on these findings, it can be concluded that selecting the appropriate algorithm is crucial in applying machine learning for agricultural product classification. Evaluation using multiple metrics provides a more comprehensive performance overview compared to relying solely on accuracy. This approach has the potential to support more efficient automation in the identification of agricultural product varieties.&lt;/p&gt;&quot;,&quot;issue&quot;:&quot;3&quot;,&quot;volume&quot;:&quot;6&quot;,&quot;container-title-short&quot;:&quot;&quot;},&quot;isTemporary&quot;:false}]}]"/>
+    <we:property name="MENDELEY_BIBLIOGRAPHY_LAST_MODIFIED" value="1781862898357"/>
+    <we:property name="MENDELEY_CITATIONS" value="[{&quot;citationID&quot;:&quot;MENDELEY_CITATION_85b285ff-eb05-414e-b0e7-6c92030e591a&quot;,&quot;properties&quot;:{&quot;noteIndex&quot;:0},&quot;isEdited&quot;:false,&quot;manualOverride&quot;:{&quot;isManuallyOverridden&quot;:false,&quot;citeprocText&quot;:&quot;[1]&quot;,&quot;manualOverrideText&quot;:&quot;&quot;},&quot;citationTag&quot;:&quot;MENDELEY_CITATION_v3_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&quot;,&quot;citationItems&quot;:[{&quot;id&quot;:&quot;bb6d3222-591a-31e6-ac30-c0ca2fa02d2c&quot;,&quot;itemData&quot;:{&quot;type&quot;:&quot;report&quot;,&quot;id&quot;:&quot;bb6d3222-591a-31e6-ac30-c0ca2fa02d2c&quot;,&quot;title&quot;:&quot;PENERAPAN DATA MINING MENGGUNAKAN ALGORITMA C4.5 UNTUK PREDIKSI PRESTASI BELAJAR SISWA DI MTS YAMUALLIM PANONGAN&quot;,&quot;author&quot;:[{&quot;family&quot;:&quot;Lestari&quot;,&quot;given&quot;:&quot;Hasanah&quot;,&quot;parse-names&quot;:false,&quot;dropping-particle&quot;:&quot;&quot;,&quot;non-dropping-particle&quot;:&quot;&quot;},{&quot;family&quot;:&quot;Irma Purnamasari&quot;,&quot;given&quot;:&quot;Ade&quot;,&quot;parse-names&quot;:false,&quot;dropping-particle&quot;:&quot;&quot;,&quot;non-dropping-particle&quot;:&quot;&quot;},{&quot;family&quot;:&quot;Suprapti&quot;,&quot;given&quot;:&quot;Tati&quot;,&quot;parse-names&quot;:false,&quot;dropping-particle&quot;:&quot;&quot;,&quot;non-dropping-particle&quot;:&quot;&quot;}],&quot;container-title&quot;:&quot;Jurnal Mahasiswa Teknik Informatika&quot;,&quot;issued&quot;:{&quot;date-parts&quot;:[[2024]]},&quot;issue&quot;:&quot;2&quot;,&quot;volume&quot;:&quot;8&quot;,&quot;container-title-short&quot;:&quot;&quot;},&quot;isTemporary&quot;:false,&quot;suppress-author&quot;:false,&quot;composite&quot;:false,&quot;author-only&quot;:false}]},{&quot;citationID&quot;:&quot;MENDELEY_CITATION_89e55e6e-f0f4-455f-96a2-832296ac850f&quot;,&quot;properties&quot;:{&quot;noteIndex&quot;:0},&quot;isEdited&quot;:false,&quot;manualOverride&quot;:{&quot;isManuallyOverridden&quot;:false,&quot;citeprocText&quot;:&quot;[2]&quot;,&quot;manualOverrideText&quot;:&quot;&quot;},&quot;citationTag&quot;:&quot;MENDELEY_CITATION_v3_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&quot;,&quot;citationItems&quot;:[{&quot;id&quot;:&quot;59e01b9c-cc29-35e1-95d0-a90f680f416f&quot;,&quot;itemData&quot;:{&quot;type&quot;:&quot;report&quot;,&quot;id&quot;:&quot;59e01b9c-cc29-35e1-95d0-a90f680f416f&quot;,&quot;title&quot;:&quot;Klasifikasi Usaha Mikro Kecil Menengah Menggunakan Jaringan Syaraf Tiruan Backpropagation&quot;,&quot;author&quot;:[{&quot;family&quot;:&quot;Hardoyo&quot;,&quot;given&quot;:&quot;T&quot;,&quot;parse-names&quot;:false,&quot;dropping-particle&quot;:&quot;&quot;,&quot;non-dropping-particle&quot;:&quot;&quot;},{&quot;family&quot;:&quot;Parmadi&quot;,&quot;given&quot;:&quot;E H&quot;,&quot;parse-names&quot;:false,&quot;dropping-particle&quot;:&quot;&quot;,&quot;non-dropping-particle&quot;:&quot;&quot;}],&quot;issued&quot;:{&quot;date-parts&quot;:[[2022]]},&quot;issue&quot;:&quot;1&quot;,&quot;volume&quot;:&quot;2&quot;,&quot;container-title-short&quot;:&quot;&quot;},&quot;isTemporary&quot;:false,&quot;suppress-author&quot;:false,&quot;composite&quot;:false,&quot;author-only&quot;:false}]},{&quot;citationID&quot;:&quot;MENDELEY_CITATION_5ec4ad9c-e7ce-4a56-b3aa-87bebdcf3f63&quot;,&quot;properties&quot;:{&quot;noteIndex&quot;:0},&quot;isEdited&quot;:false,&quot;manualOverride&quot;:{&quot;isManuallyOverridden&quot;:false,&quot;citeprocText&quot;:&quot;[3]&quot;,&quot;manualOverrideText&quot;:&quot;&quot;},&quot;citationTag&quot;:&quot;MENDELEY_CITATION_v3_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&quot;,&quot;citationItems&quot;:[{&quot;id&quot;:&quot;44ead8d1-f939-36e5-a35c-af2bfd7d82d2&quot;,&quot;itemData&quot;:{&quot;type&quot;:&quot;article-journal&quot;,&quot;id&quot;:&quot;44ead8d1-f939-36e5-a35c-af2bfd7d82d2&quot;,&quot;title&quot;:&quot;Penggunaan Algoritma K-Nearest Neighbor (KNN) Untuk Mendeteksi Stunting Pada Anak&quot;,&quot;author&quot;:[{&quot;family&quot;:&quot;Situmeang&quot;,&quot;given&quot;:&quot;Natalia&quot;,&quot;parse-names&quot;:false,&quot;dropping-particle&quot;:&quot;&quot;,&quot;non-dropping-particle&quot;:&quot;&quot;},{&quot;family&quot;:&quot;Artamezia Komarsyah&quot;,&quot;given&quot;:&quot;Eliena&quot;,&quot;parse-names&quot;:false,&quot;dropping-particle&quot;:&quot;&quot;,&quot;non-dropping-particle&quot;:&quot;&quot;},{&quot;family&quot;:&quot;Fauzi&quot;,&quot;given&quot;:&quot;Ahmad&quot;,&quot;parse-names&quot;:false,&quot;dropping-particle&quot;:&quot;&quot;,&quot;non-dropping-particle&quot;:&quot;&quot;},{&quot;family&quot;:&quot;Sagala&quot;,&quot;given&quot;:&quot;Jepri&quot;,&quot;parse-names&quot;:false,&quot;dropping-particle&quot;:&quot;&quot;,&quot;non-dropping-particle&quot;:&quot;&quot;}],&quot;container-title&quot;:&quot;Jepri Sagala INNOVATIVE: Journal Of Social Science Research&quot;,&quot;ISSN&quot;:&quot;2807-4246&quot;,&quot;issued&quot;:{&quot;date-parts&quot;:[[2024]]},&quot;page&quot;:&quot;8401-8417&quot;,&quot;volume&quot;:&quot;5&quot;,&quot;container-title-short&quot;:&quot;&quot;},&quot;isTemporary&quot;:false}]},{&quot;citationID&quot;:&quot;MENDELEY_CITATION_e4b9b07c-4f20-4e3a-b016-7087b59d701c&quot;,&quot;properties&quot;:{&quot;noteIndex&quot;:0},&quot;isEdited&quot;:false,&quot;manualOverride&quot;:{&quot;isManuallyOverridden&quot;:false,&quot;citeprocText&quot;:&quot;[4]&quot;,&quot;manualOverrideText&quot;:&quot;&quot;},&quot;citationTag&quot;:&quot;MENDELEY_CITATION_v3_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&quot;,&quot;citationItems&quot;:[{&quot;id&quot;:&quot;0a2fa567-d44d-391d-bfd8-777eb3076c2e&quot;,&quot;itemData&quot;:{&quot;type&quot;:&quot;report&quot;,&quot;id&quot;:&quot;0a2fa567-d44d-391d-bfd8-777eb3076c2e&quot;,&quot;title&quot;:&quot;PENERAPAN ALGORITMA K-NEAREST NEIGHBOR (KNN) DALAM KLASIFIKASI PENILAIAN JAWABAN UJISAN ESAI&quot;,&quot;author&quot;:[{&quot;family&quot;:&quot;Mubarok&quot;,&quot;given&quot;:&quot;Muhammad Iqbal&quot;,&quot;parse-names&quot;:false,&quot;dropping-particle&quot;:&quot;&quot;,&quot;non-dropping-particle&quot;:&quot;&quot;},{&quot;family&quot;:&quot;Informatika&quot;,&quot;given&quot;:&quot;Carudin&quot;,&quot;parse-names&quot;:false,&quot;dropping-particle&quot;:&quot;&quot;,&quot;non-dropping-particle&quot;:&quot;&quot;},{&quot;family&quot;:&quot;Karawang&quot;,&quot;given&quot;:&quot;Singaperbangsa&quot;,&quot;parse-names&quot;:false,&quot;dropping-particle&quot;:&quot;&quot;,&quot;non-dropping-particle&quot;:&quot;&quot;},{&quot;family&quot;:&quot;Ronggo Waluyo&quot;,&quot;given&quot;:&quot;Jl Hs&quot;,&quot;parse-names&quot;:false,&quot;dropping-particle&quot;:&quot;&quot;,&quot;non-dropping-particle&quot;:&quot;&quot;},{&quot;family&quot;:&quot;Timur&quot;,&quot;given&quot;:&quot;Telukjambe&quot;,&quot;parse-names&quot;:false,&quot;dropping-particle&quot;:&quot;&quot;,&quot;non-dropping-particle&quot;:&quot;&quot;},{&quot;family&quot;:&quot;Karawang&quot;,&quot;given&quot;:&quot;Indonesia&quot;,&quot;parse-names&quot;:false,&quot;dropping-particle&quot;:&quot;&quot;,&quot;non-dropping-particle&quot;:&quot;&quot;}],&quot;container-title&quot;:&quot;Jurnal Mahasiswa Teknik Informatika&quot;,&quot;issued&quot;:{&quot;date-parts&quot;:[[2023]]},&quot;issue&quot;:&quot;5&quot;,&quot;volume&quot;:&quot;7&quot;,&quot;container-title-short&quot;:&quot;&quot;},&quot;isTemporary&quot;:false}]},{&quot;citationID&quot;:&quot;MENDELEY_CITATION_9bc9d9f6-26e2-4935-8320-bb4da4f5c188&quot;,&quot;properties&quot;:{&quot;noteIndex&quot;:0},&quot;isEdited&quot;:false,&quot;manualOverride&quot;:{&quot;isManuallyOverridden&quot;:false,&quot;citeprocText&quot;:&quot;[5]&quot;,&quot;manualOverrideText&quot;:&quot;&quot;},&quot;citationTag&quot;:&quot;MENDELEY_CITATION_v3_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&quot;,&quot;citationItems&quot;:[{&quot;id&quot;:&quot;1a74c63f-dea5-30cd-a22b-f9b69bb9c504&quot;,&quot;itemData&quot;:{&quot;type&quot;:&quot;article-journal&quot;,&quot;id&quot;:&quot;1a74c63f-dea5-30cd-a22b-f9b69bb9c504&quot;,&quot;title&quot;:&quot;MALCOM: Indonesian Journal of Machine Learning and Computer Science Implementation of Decision Tree Algorithm and Support Vector Machine for Lung Cancer Classification Implementasi Algoritma Decision Tree dan Support Vector Machine untuk Klasifikasi Penyakit Kanker Paru&quot;,&quot;author&quot;:[{&quot;family&quot;:&quot;Homepage&quot;,&quot;given&quot;:&quot;Journal&quot;,&quot;parse-names&quot;:false,&quot;dropping-particle&quot;:&quot;&quot;,&quot;non-dropping-particle&quot;:&quot;&quot;},{&quot;family&quot;:&quot;Septhya&quot;,&quot;given&quot;:&quot;Dhini&quot;,&quot;parse-names&quot;:false,&quot;dropping-particle&quot;:&quot;&quot;,&quot;non-dropping-particle&quot;:&quot;&quot;},{&quot;family&quot;:&quot;Rahayu&quot;,&quot;given&quot;:&quot;Kharisma&quot;,&quot;parse-names&quot;:false,&quot;dropping-particle&quot;:&quot;&quot;,&quot;non-dropping-particle&quot;:&quot;&quot;},{&quot;family&quot;:&quot;Rabbani&quot;,&quot;given&quot;:&quot;Salsabila&quot;,&quot;parse-names&quot;:false,&quot;dropping-particle&quot;:&quot;&quot;,&quot;non-dropping-particle&quot;:&quot;&quot;},{&quot;family&quot;:&quot;Fitria&quot;,&quot;given&quot;:&quot;Vindi&quot;,&quot;parse-names&quot;:false,&quot;dropping-particle&quot;:&quot;&quot;,&quot;non-dropping-particle&quot;:&quot;&quot;},{&quot;family&quot;:&quot;Irawan&quot;,&quot;given&quot;:&quot;Yuda&quot;,&quot;parse-names&quot;:false,&quot;dropping-particle&quot;:&quot;&quot;,&quot;non-dropping-particle&quot;:&quot;&quot;},{&quot;family&quot;:&quot;Hayami&quot;,&quot;given&quot;:&quot;Regiolina&quot;,&quot;parse-names&quot;:false,&quot;dropping-particle&quot;:&quot;&quot;,&quot;non-dropping-particle&quot;:&quot;&quot;}],&quot;ISSN&quot;:&quot;2775-8575&quot;,&quot;issued&quot;:{&quot;date-parts&quot;:[[2023]]},&quot;page&quot;:&quot;15-19&quot;,&quot;volume&quot;:&quot;3&quot;,&quot;container-title-short&quot;:&quot;&quot;},&quot;isTemporary&quot;:false,&quot;suppress-author&quot;:false,&quot;composite&quot;:false,&quot;author-only&quot;:false}]},{&quot;citationID&quot;:&quot;MENDELEY_CITATION_d4994bae-18ac-4e16-a4c4-a3fb2cef3ce3&quot;,&quot;properties&quot;:{&quot;noteIndex&quot;:0},&quot;isEdited&quot;:false,&quot;manualOverride&quot;:{&quot;isManuallyOverridden&quot;:false,&quot;citeprocText&quot;:&quot;[6]&quot;,&quot;manualOverrideText&quot;:&quot;&quot;},&quot;citationTag&quot;:&quot;MENDELEY_CITATION_v3_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&quot;,&quot;citationItems&quot;:[{&quot;id&quot;:&quot;7079eb5c-6a90-328a-b086-8e0eeae04100&quot;,&quot;itemData&quot;:{&quot;type&quot;:&quot;article-journal&quot;,&quot;id&quot;:&quot;7079eb5c-6a90-328a-b086-8e0eeae04100&quot;,&quot;title&quot;:&quot;Analisis Sentimen Masyarakat Terhadap Penggunaan E-Commerce Menggunakan Algoritma K-Nearest Neighbor&quot;,&quot;author&quot;:[{&quot;family&quot;:&quot;Habib Kusuma&quot;,&quot;given&quot;:&quot;Ikhsan&quot;,&quot;parse-names&quot;:false,&quot;dropping-particle&quot;:&quot;&quot;,&quot;non-dropping-particle&quot;:&quot;&quot;},{&quot;family&quot;:&quot;Cahyono&quot;,&quot;given&quot;:&quot;Nuri&quot;,&quot;parse-names&quot;:false,&quot;dropping-particle&quot;:&quot;&quot;,&quot;non-dropping-particle&quot;:&quot;&quot;}],&quot;ISSN&quot;:&quot;2548-9356&quot;,&quot;issued&quot;:{&quot;date-parts&quot;:[[2023]]},&quot;abstract&quot;:&quot;− E-commerce's rapid growth has resulted in an increase in online transactions and shifts in consumer behavior. In Indonesia, the use of e-commerce has grown rapidly, with many online platforms emerging. Understanding public sentiment towards e-commerce in Indonesia is crucial for businesses to improve their services and maintain customer satisfaction. In this review, study propose a methodology for feeling investigation of popular assessment on the utilization of web-based business in Indonesia, utilizing directed learning calculations. The study involved collecting data from the website Google Play Store. The study performed data preprocessing, including removing stop words, tokenization, and stemming, before applying the K-Nearest Neighbor (K-NN) algorithm to classify sentiments into positive or negative. The evaluation was conducted using confusion matrix and classification report. The results showed that the proposed approach was effective in analyzing public sentiment towards e-commerce in Indonesia, with an accuracy rate of 82%. The study concluded that the proposed strategy could help businesses enhance their services and better satisfy customers' requirements and expectations. Abstrak − Perkembangan e-commerce yang pesat telah menyebabkan peningkatan transaksi online dan perubahan perilaku konsumen. Di Indonesia, penggunaan e-commerce tumbuh pesat dengan banyak platform online bermunculan. Memahami sentimen masyarakat terhadap e-commerce di Indonesia sangat penting bagi bisnis untuk meningkatkan layanan dan menjaga kepuasan pelanggan. Oleh karena itu, dalam penelitian ini peneliti mengusulkan sebuah pendekatan untuk melakukan analisis sentimen opini publik mengenai penggunaan salah satu e-commerce di Indonesia dengan menggunakan algoritma K-Nearest Neighbor. Pengumpulan data dilakukan dari website Google Play Store dengan tujuan untuk memperoleh pandangan dan pengalaman masyarakat terkait penggunaan salah satu e-commerce di Indonesia. Setelah data terkumpul, dilakukan proses preprocessing untuk membersihkan data, termasuk menghilangkan stopwords, tokenisasi, dan stemming. Setelah itu, algoritma K-Nearest Neighbor (K-NN) digunakan untuk mengklasifikasikan sentimen menjadi positif atau negatif. Evaluasi dilakukan dengan menggunakan confusion matrix dan classification report untuk menilai keakuratan algoritma. Hasil penelitian menunjukan bahwa pendekatan yang diusulkan efektif dalam menganalisis sentimen masyarakat terhadap e-commerce di Indonesia, dengan tingkat akurasi 82%. Penelitian ini memiliki implikasi penting bagi bisnis e-commerce di Indonesia dalam meningkatkan layanan dan memenuhi kebutuhan serta harapan pelanggan secara lebih baik.&quot;,&quot;issue&quot;:&quot;3&quot;,&quot;volume&quot;:&quot;8&quot;,&quot;container-title-short&quot;:&quot;&quot;},&quot;isTemporary&quot;:false,&quot;suppress-author&quot;:false,&quot;composite&quot;:false,&quot;author-only&quot;:false}]},{&quot;citationID&quot;:&quot;MENDELEY_CITATION_f2cd7554-d888-4c69-ac96-d576f7ea2ea4&quot;,&quot;properties&quot;:{&quot;noteIndex&quot;:0},&quot;isEdited&quot;:false,&quot;manualOverride&quot;:{&quot;isManuallyOverridden&quot;:false,&quot;citeprocText&quot;:&quot;[5]&quot;,&quot;manualOverrideText&quot;:&quot;&quot;},&quot;citationTag&quot;:&quot;MENDELEY_CITATION_v3_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&quot;,&quot;citationItems&quot;:[{&quot;id&quot;:&quot;1a74c63f-dea5-30cd-a22b-f9b69bb9c504&quot;,&quot;itemData&quot;:{&quot;type&quot;:&quot;article-journal&quot;,&quot;id&quot;:&quot;1a74c63f-dea5-30cd-a22b-f9b69bb9c504&quot;,&quot;title&quot;:&quot;MALCOM: Indonesian Journal of Machine Learning and Computer Science Implementation of Decision Tree Algorithm and Support Vector Machine for Lung Cancer Classification Implementasi Algoritma Decision Tree dan Support Vector Machine untuk Klasifikasi Penyakit Kanker Paru&quot;,&quot;author&quot;:[{&quot;family&quot;:&quot;Homepage&quot;,&quot;given&quot;:&quot;Journal&quot;,&quot;parse-names&quot;:false,&quot;dropping-particle&quot;:&quot;&quot;,&quot;non-dropping-particle&quot;:&quot;&quot;},{&quot;family&quot;:&quot;Septhya&quot;,&quot;given&quot;:&quot;Dhini&quot;,&quot;parse-names&quot;:false,&quot;dropping-particle&quot;:&quot;&quot;,&quot;non-dropping-particle&quot;:&quot;&quot;},{&quot;family&quot;:&quot;Rahayu&quot;,&quot;given&quot;:&quot;Kharisma&quot;,&quot;parse-names&quot;:false,&quot;dropping-particle&quot;:&quot;&quot;,&quot;non-dropping-particle&quot;:&quot;&quot;},{&quot;family&quot;:&quot;Rabbani&quot;,&quot;given&quot;:&quot;Salsabila&quot;,&quot;parse-names&quot;:false,&quot;dropping-particle&quot;:&quot;&quot;,&quot;non-dropping-particle&quot;:&quot;&quot;},{&quot;family&quot;:&quot;Fitria&quot;,&quot;given&quot;:&quot;Vindi&quot;,&quot;parse-names&quot;:false,&quot;dropping-particle&quot;:&quot;&quot;,&quot;non-dropping-particle&quot;:&quot;&quot;},{&quot;family&quot;:&quot;Irawan&quot;,&quot;given&quot;:&quot;Yuda&quot;,&quot;parse-names&quot;:false,&quot;dropping-particle&quot;:&quot;&quot;,&quot;non-dropping-particle&quot;:&quot;&quot;},{&quot;family&quot;:&quot;Hayami&quot;,&quot;given&quot;:&quot;Regiolina&quot;,&quot;parse-names&quot;:false,&quot;dropping-particle&quot;:&quot;&quot;,&quot;non-dropping-particle&quot;:&quot;&quot;}],&quot;ISSN&quot;:&quot;2775-8575&quot;,&quot;issued&quot;:{&quot;date-parts&quot;:[[2023]]},&quot;page&quot;:&quot;15-19&quot;,&quot;volume&quot;:&quot;3&quot;,&quot;container-title-short&quot;:&quot;&quot;},&quot;isTemporary&quot;:false,&quot;suppress-author&quot;:false,&quot;composite&quot;:false,&quot;author-only&quot;:false}]},{&quot;citationID&quot;:&quot;MENDELEY_CITATION_056d18f0-790c-4def-af03-d5baa5309659&quot;,&quot;properties&quot;:{&quot;noteIndex&quot;:0},&quot;isEdited&quot;:false,&quot;manualOverride&quot;:{&quot;isManuallyOverridden&quot;:false,&quot;citeprocText&quot;:&quot;[7]&quot;,&quot;manualOverrideText&quot;:&quot;&quot;},&quot;citationTag&quot;:&quot;MENDELEY_CITATION_v3_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&quot;,&quot;citationItems&quot;:[{&quot;id&quot;:&quot;8ae1f53c-ab45-3874-828d-80de4856364a&quot;,&quot;itemData&quot;:{&quot;type&quot;:&quot;report&quot;,&quot;id&quot;:&quot;8ae1f53c-ab45-3874-828d-80de4856364a&quot;,&quot;title&quot;:&quot;ANALISIS PERBANDINGAN ALGORITMA DECISIOIN TREE DAN NAÏVE UNTUK MENGEVALUASI PRESTASI BELAJAR SISWA STUDI KASUS: SMK AL-MUSYAWIRIN&quot;,&quot;author&quot;:[{&quot;family&quot;:&quot;Fauzan&quot;,&quot;given&quot;:&quot;Aldi Sholihin&quot;,&quot;parse-names&quot;:false,&quot;dropping-particle&quot;:&quot;&quot;,&quot;non-dropping-particle&quot;:&quot;&quot;},{&quot;family&quot;:&quot;Irma&quot;,&quot;given&quot;:&quot;Ade&quot;,&quot;parse-names&quot;:false,&quot;dropping-particle&quot;:&quot;&quot;,&quot;non-dropping-particle&quot;:&quot;&quot;},{&quot;family&quot;:&quot;Sari&quot;,&quot;given&quot;:&quot;Purnama&quot;,&quot;parse-names&quot;:false,&quot;dropping-particle&quot;:&quot;&quot;,&quot;non-dropping-particle&quot;:&quot;&quot;},{&quot;family&quot;:&quot;Ali&quot;,&quot;given&quot;:&quot;Irfan&quot;,&quot;parse-names&quot;:false,&quot;dropping-particle&quot;:&quot;&quot;,&quot;non-dropping-particle&quot;:&quot;&quot;}],&quot;container-title&quot;:&quot;Jurnal Mahasiswa Teknik Informatika&quot;,&quot;issued&quot;:{&quot;date-parts&quot;:[[2024]]},&quot;issue&quot;:&quot;1&quot;,&quot;volume&quot;:&quot;8&quot;,&quot;container-title-short&quot;:&quot;&quot;},&quot;isTemporary&quot;:false}]},{&quot;citationID&quot;:&quot;MENDELEY_CITATION_bc98dd7b-12f4-427d-b7b0-4e3e431286c7&quot;,&quot;properties&quot;:{&quot;noteIndex&quot;:0},&quot;isEdited&quot;:false,&quot;manualOverride&quot;:{&quot;isManuallyOverridden&quot;:false,&quot;citeprocText&quot;:&quot;[7]&quot;,&quot;manualOverrideText&quot;:&quot;&quot;},&quot;citationTag&quot;:&quot;MENDELEY_CITATION_v3_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&quot;,&quot;citationItems&quot;:[{&quot;id&quot;:&quot;8ae1f53c-ab45-3874-828d-80de4856364a&quot;,&quot;itemData&quot;:{&quot;type&quot;:&quot;report&quot;,&quot;id&quot;:&quot;8ae1f53c-ab45-3874-828d-80de4856364a&quot;,&quot;title&quot;:&quot;ANALISIS PERBANDINGAN ALGORITMA DECISIOIN TREE DAN NAÏVE UNTUK MENGEVALUASI PRESTASI BELAJAR SISWA STUDI KASUS: SMK AL-MUSYAWIRIN&quot;,&quot;author&quot;:[{&quot;family&quot;:&quot;Fauzan&quot;,&quot;given&quot;:&quot;Aldi Sholihin&quot;,&quot;parse-names&quot;:false,&quot;dropping-particle&quot;:&quot;&quot;,&quot;non-dropping-particle&quot;:&quot;&quot;},{&quot;family&quot;:&quot;Irma&quot;,&quot;given&quot;:&quot;Ade&quot;,&quot;parse-names&quot;:false,&quot;dropping-particle&quot;:&quot;&quot;,&quot;non-dropping-particle&quot;:&quot;&quot;},{&quot;family&quot;:&quot;Sari&quot;,&quot;given&quot;:&quot;Purnama&quot;,&quot;parse-names&quot;:false,&quot;dropping-particle&quot;:&quot;&quot;,&quot;non-dropping-particle&quot;:&quot;&quot;},{&quot;family&quot;:&quot;Ali&quot;,&quot;given&quot;:&quot;Irfan&quot;,&quot;parse-names&quot;:false,&quot;dropping-particle&quot;:&quot;&quot;,&quot;non-dropping-particle&quot;:&quot;&quot;}],&quot;container-title&quot;:&quot;Jurnal Mahasiswa Teknik Informatika&quot;,&quot;issued&quot;:{&quot;date-parts&quot;:[[2024]]},&quot;issue&quot;:&quot;1&quot;,&quot;volume&quot;:&quot;8&quot;,&quot;container-title-short&quot;:&quot;&quot;},&quot;isTemporary&quot;:false}]},{&quot;citationID&quot;:&quot;MENDELEY_CITATION_a24887d4-9676-49e6-8762-0b3808ef033a&quot;,&quot;properties&quot;:{&quot;noteIndex&quot;:0},&quot;isEdited&quot;:false,&quot;manualOverride&quot;:{&quot;isManuallyOverridden&quot;:false,&quot;citeprocText&quot;:&quot;[8]&quot;,&quot;manualOverrideText&quot;:&quot;&quot;},&quot;citationTag&quot;:&quot;MENDELEY_CITATION_v3_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&quot;,&quot;citationItems&quot;:[{&quot;id&quot;:&quot;1aba658f-c481-3077-b7aa-192c8f4e08ff&quot;,&quot;itemData&quot;:{&quot;type&quot;:&quot;article-journal&quot;,&quot;id&quot;:&quot;1aba658f-c481-3077-b7aa-192c8f4e08ff&quot;,&quot;title&quot;:&quot;Perbandingan Algoritma Naïve Bayes dan K-Nearest Neighbor (KNN) untuk Mengetahui Keakuratan Diagnosa Penyakit Diabetes&quot;,&quot;author&quot;:[{&quot;family&quot;:&quot;Puteri&quot;,&quot;given&quot;:&quot;Qonitah Alia&quot;,&quot;parse-names&quot;:false,&quot;dropping-particle&quot;:&quot;&quot;,&quot;non-dropping-particle&quot;:&quot;&quot;},{&quot;family&quot;:&quot;Sagirani&quot;,&quot;given&quot;:&quot;Tri&quot;,&quot;parse-names&quot;:false,&quot;dropping-particle&quot;:&quot;&quot;,&quot;non-dropping-particle&quot;:&quot;&quot;},{&quot;family&quot;:&quot;Lemantara&quot;,&quot;given&quot;:&quot;Julianto&quot;,&quot;parse-names&quot;:false,&quot;dropping-particle&quot;:&quot;&quot;,&quot;non-dropping-particle&quot;:&quot;&quot;}],&quot;container-title&quot;:&quot;Jurnal Nasional Teknologi dan Sistem Informasi&quot;,&quot;DOI&quot;:&quot;10.25077/teknosi.v9i3.2023.247-254&quot;,&quot;ISSN&quot;:&quot;2460-3465&quot;,&quot;issued&quot;:{&quot;date-parts&quot;:[[2023,12,31]]},&quot;page&quot;:&quot;247-254&quot;,&quot;abstract&quot;:&quot;Diabetes adalah gangguan metabolisme kronis di mana pankreas tidak bisa menciptakan insulin yang cukup ataupun tubuh tidak berhasil menggunakan insulin yang telah dihasilkan. Penyebab yang dapat menimbulkan terjadinya penyakit diabetes berawal dari  banyak antara lain penyebab genetik dan lingkungan. Diabetes tidak hanya menyebabkan kerugian ekonomi bagi pasien karena biaya pengobatan tetapi juga memperpendek umur peluang untuk hidup sebesar 5 – 10 tahun. Akibat lainnya adalah jika  tidak ada upaya untuk mengontrol dan mencegah, diabetes dapat semakin memperburuk penderita karena dapat menimbulkan komplikasi yang berat. Berdasarkan permasalahan tersebut dapat dilakukan prediksi penyakit diabetes untuk  dapat membantu tenaga medis mengetahu lebih dini kondisi pasien. Algoritma Naive Bayes dan K-Nearest neighbor (KNN) bisa digunakan membantu prediksi  penyakit diabetes dengan menggunakan software RapidMiner Python. Hasil penelitian ini dievaluasi dengan Confusion Matrix serta Nilai AUC. Hasil metode Naïve Bayes adalah 77% dengan nilai AUC 0.83 sedangkan metode K-nearest neighbor (KNN=3) adalah 71% dengan nilai AUC 0.75, KNN=5 adalah 69% dengan AUC 0.76, dan KNN=7 adalah 68% dengan AUC 0.75 sehingga dapat disimpulkan bahwa algoritma naïve bayes lebih unggul dibandingkan dengan KNN, meski pada penelitian ini untuk algoritma KNN menggunakan K=3, K=5 dan K=7, lalu untuk untuk yang KNN dari ketiga K yang digunakan dari segi confusion matrix KNN=3 lebih unggul sedangkan dari nilai AUC yaitu KNN=5.&quot;,&quot;publisher&quot;:&quot;Universitas Andalas&quot;,&quot;issue&quot;:&quot;3&quot;,&quot;volume&quot;:&quot;9&quot;,&quot;container-title-short&quot;:&quot;&quot;},&quot;isTemporary&quot;:false}]},{&quot;citationID&quot;:&quot;MENDELEY_CITATION_a0039dc8-53a4-46e3-b5ed-0abab40a5708&quot;,&quot;properties&quot;:{&quot;noteIndex&quot;:0},&quot;isEdited&quot;:false,&quot;manualOverride&quot;:{&quot;isManuallyOverridden&quot;:false,&quot;citeprocText&quot;:&quot;[8]&quot;,&quot;manualOverrideText&quot;:&quot;&quot;},&quot;citationTag&quot;:&quot;MENDELEY_CITATION_v3_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&quot;,&quot;citationItems&quot;:[{&quot;id&quot;:&quot;1aba658f-c481-3077-b7aa-192c8f4e08ff&quot;,&quot;itemData&quot;:{&quot;type&quot;:&quot;article-journal&quot;,&quot;id&quot;:&quot;1aba658f-c481-3077-b7aa-192c8f4e08ff&quot;,&quot;title&quot;:&quot;Perbandingan Algoritma Naïve Bayes dan K-Nearest Neighbor (KNN) untuk Mengetahui Keakuratan Diagnosa Penyakit Diabetes&quot;,&quot;author&quot;:[{&quot;family&quot;:&quot;Puteri&quot;,&quot;given&quot;:&quot;Qonitah Alia&quot;,&quot;parse-names&quot;:false,&quot;dropping-particle&quot;:&quot;&quot;,&quot;non-dropping-particle&quot;:&quot;&quot;},{&quot;family&quot;:&quot;Sagirani&quot;,&quot;given&quot;:&quot;Tri&quot;,&quot;parse-names&quot;:false,&quot;dropping-particle&quot;:&quot;&quot;,&quot;non-dropping-particle&quot;:&quot;&quot;},{&quot;family&quot;:&quot;Lemantara&quot;,&quot;given&quot;:&quot;Julianto&quot;,&quot;parse-names&quot;:false,&quot;dropping-particle&quot;:&quot;&quot;,&quot;non-dropping-particle&quot;:&quot;&quot;}],&quot;container-title&quot;:&quot;Jurnal Nasional Teknologi dan Sistem Informasi&quot;,&quot;DOI&quot;:&quot;10.25077/teknosi.v9i3.2023.247-254&quot;,&quot;ISSN&quot;:&quot;2460-3465&quot;,&quot;issued&quot;:{&quot;date-parts&quot;:[[2023,12,31]]},&quot;page&quot;:&quot;247-254&quot;,&quot;abstract&quot;:&quot;Diabetes adalah gangguan metabolisme kronis di mana pankreas tidak bisa menciptakan insulin yang cukup ataupun tubuh tidak berhasil menggunakan insulin yang telah dihasilkan. Penyebab yang dapat menimbulkan terjadinya penyakit diabetes berawal dari  banyak antara lain penyebab genetik dan lingkungan. Diabetes tidak hanya menyebabkan kerugian ekonomi bagi pasien karena biaya pengobatan tetapi juga memperpendek umur peluang untuk hidup sebesar 5 – 10 tahun. Akibat lainnya adalah jika  tidak ada upaya untuk mengontrol dan mencegah, diabetes dapat semakin memperburuk penderita karena dapat menimbulkan komplikasi yang berat. Berdasarkan permasalahan tersebut dapat dilakukan prediksi penyakit diabetes untuk  dapat membantu tenaga medis mengetahu lebih dini kondisi pasien. Algoritma Naive Bayes dan K-Nearest neighbor (KNN) bisa digunakan membantu prediksi  penyakit diabetes dengan menggunakan software RapidMiner Python. Hasil penelitian ini dievaluasi dengan Confusion Matrix serta Nilai AUC. Hasil metode Naïve Bayes adalah 77% dengan nilai AUC 0.83 sedangkan metode K-nearest neighbor (KNN=3) adalah 71% dengan nilai AUC 0.75, KNN=5 adalah 69% dengan AUC 0.76, dan KNN=7 adalah 68% dengan AUC 0.75 sehingga dapat disimpulkan bahwa algoritma naïve bayes lebih unggul dibandingkan dengan KNN, meski pada penelitian ini untuk algoritma KNN menggunakan K=3, K=5 dan K=7, lalu untuk untuk yang KNN dari ketiga K yang digunakan dari segi confusion matrix KNN=3 lebih unggul sedangkan dari nilai AUC yaitu KNN=5.&quot;,&quot;publisher&quot;:&quot;Universitas Andalas&quot;,&quot;issue&quot;:&quot;3&quot;,&quot;volume&quot;:&quot;9&quot;,&quot;container-title-short&quot;:&quot;&quot;},&quot;isTemporary&quot;:false}]},{&quot;citationID&quot;:&quot;MENDELEY_CITATION_4f859785-31c9-4639-beb2-0f00949de98a&quot;,&quot;properties&quot;:{&quot;noteIndex&quot;:0},&quot;isEdited&quot;:false,&quot;manualOverride&quot;:{&quot;isManuallyOverridden&quot;:false,&quot;citeprocText&quot;:&quot;[9]&quot;,&quot;manualOverrideText&quot;:&quot;&quot;},&quot;citationTag&quot;:&quot;MENDELEY_CITATION_v3_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&quot;,&quot;citationItems&quot;:[{&quot;id&quot;:&quot;c611b54b-7c00-377d-994e-816a18561027&quot;,&quot;itemData&quot;:{&quot;type&quot;:&quot;article-journal&quot;,&quot;id&quot;:&quot;c611b54b-7c00-377d-994e-816a18561027&quot;,&quot;title&quot;:&quot;PENGARUH KOMPOSISI SPLIT DATA PADA AKURASI KLASIFIKASI PENDERITA DIABETES MENGGUNAKAN ALGORITMA MACHINE LEARNING&quot;,&quot;author&quot;:[{&quot;family&quot;:&quot;Refindha&quot;,&quot;given&quot;:&quot;Febby&quot;,&quot;parse-names&quot;:false,&quot;dropping-particle&quot;:&quot;&quot;,&quot;non-dropping-particle&quot;:&quot;&quot;},{&quot;family&quot;:&quot;Harianto&quot;,&quot;given&quot;:&quot;Aftha&quot;,&quot;parse-names&quot;:false,&quot;dropping-particle&quot;:&quot;&quot;,&quot;non-dropping-particle&quot;:&quot;&quot;},{&quot;family&quot;:&quot;Alawi&quot;,&quot;given&quot;:&quot;Zakki&quot;,&quot;parse-names&quot;:false,&quot;dropping-particle&quot;:&quot;&quot;,&quot;non-dropping-particle&quot;:&quot;&quot;},{&quot;family&quot;:&quot;Sa'ida&quot;,&quot;given&quot;:&quot;Ita Aristia&quot;,&quot;parse-names&quot;:false,&quot;dropping-particle&quot;:&quot;&quot;,&quot;non-dropping-particle&quot;:&quot;&quot;}],&quot;container-title&quot;:&quot;Jurnal Sistem Informasi dan Informatika (Simika)&quot;,&quot;ISSN&quot;:&quot;2622-6375&quot;,&quot;issued&quot;:{&quot;date-parts&quot;:[[2025]]},&quot;abstract&quot;:&quot;The increasing number of people with diabetes is an international health problem. To prevent diabetic complications, early diagnosis and accurate classification are essential. This study looks at how the composition of split data affects the classification performance of diabetics with machine learning algorithms such as Random Forest, Naive Bayes, and Support Vector Machine (SVM).&quot;,&quot;issue&quot;:&quot;1&quot;,&quot;volume&quot;:&quot;8&quot;,&quot;container-title-short&quot;:&quot;&quot;},&quot;isTemporary&quot;:false,&quot;suppress-author&quot;:false,&quot;composite&quot;:false,&quot;author-only&quot;:false}]},{&quot;citationID&quot;:&quot;MENDELEY_CITATION_ab32046d-6187-4f3d-a6d4-2708f285d141&quot;,&quot;properties&quot;:{&quot;noteIndex&quot;:0},&quot;isEdited&quot;:false,&quot;manualOverride&quot;:{&quot;isManuallyOverridden&quot;:false,&quot;citeprocText&quot;:&quot;[10]&quot;,&quot;manualOverrideText&quot;:&quot;&quot;},&quot;citationTag&quot;:&quot;MENDELEY_CITATION_v3_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&quot;,&quot;citationItems&quot;:[{&quot;id&quot;:&quot;594bdb54-c074-3867-beb1-dd4dd232b72c&quot;,&quot;itemData&quot;:{&quot;type&quot;:&quot;article-journal&quot;,&quot;id&quot;:&quot;594bdb54-c074-3867-beb1-dd4dd232b72c&quot;,&quot;title&quot;:&quot;Klasifikasi Kualitas Jambu Air Madu Deli Merah, Dengan Menerapkan Metode K-NN model Euclidean Distance&quot;,&quot;author&quot;:[{&quot;family&quot;:&quot;Kualitas&quot;,&quot;given&quot;:&quot;Klasifikasi&quot;,&quot;parse-names&quot;:false,&quot;dropping-particle&quot;:&quot;&quot;,&quot;non-dropping-particle&quot;:&quot;&quot;},{&quot;family&quot;:&quot;Air&quot;,&quot;given&quot;:&quot;Jambu&quot;,&quot;parse-names&quot;:false,&quot;dropping-particle&quot;:&quot;&quot;,&quot;non-dropping-particle&quot;:&quot;&quot;},{&quot;family&quot;:&quot;Merah&quot;,&quot;given&quot;:&quot;Madu Deli&quot;,&quot;parse-names&quot;:false,&quot;dropping-particle&quot;:&quot;&quot;,&quot;non-dropping-particle&quot;:&quot;&quot;},{&quot;family&quot;:&quot;Dengan&quot;,&quot;given&quot;:&quot;Menerapkan&quot;,&quot;parse-names&quot;:false,&quot;dropping-particle&quot;:&quot;&quot;,&quot;non-dropping-particle&quot;:&quot;&quot;},{&quot;family&quot;:&quot;Metode&quot;,&quot;given&quot;:&quot;K-Nn&quot;,&quot;parse-names&quot;:false,&quot;dropping-particle&quot;:&quot;&quot;,&quot;non-dropping-particle&quot;:&quot;&quot;},{&quot;family&quot;:&quot;Distance -Fadlan&quot;,&quot;given&quot;:&quot;Euclidean&quot;,&quot;parse-names&quot;:false,&quot;dropping-particle&quot;:&quot;&quot;,&quot;non-dropping-particle&quot;:&quot;&quot;},{&quot;family&quot;:&quot;Ramadhan&quot;,&quot;given&quot;:&quot;Zuhri&quot;,&quot;parse-names&quot;:false,&quot;dropping-particle&quot;:&quot;&quot;,&quot;non-dropping-particle&quot;:&quot;&quot;},{&quot;family&quot;:&quot;Ramadhan&quot;,&quot;given&quot;:&quot;Fadlan Zuhri&quot;,&quot;parse-names&quot;:false,&quot;dropping-particle&quot;:&quot;&quot;,&quot;non-dropping-particle&quot;:&quot;&quot;},{&quot;family&quot;:&quot;Aripin&quot;,&quot;given&quot;:&quot;Soeb&quot;,&quot;parse-names&quot;:false,&quot;dropping-particle&quot;:&quot;&quot;,&quot;non-dropping-particle&quot;:&quot;&quot;},{&quot;family&quot;:&quot;Ulfa&quot;,&quot;given&quot;:&quot;Kurnia&quot;,&quot;parse-names&quot;:false,&quot;dropping-particle&quot;:&quot;&quot;,&quot;non-dropping-particle&quot;:&quot;&quot;}],&quot;DOI&quot;:&quot;10.54209/jatilima.v7i05.1633&quot;,&quot;URL&quot;:&quot;https://journal.cattleyadf.org/index.php/jatilima/index&quot;,&quot;issued&quot;:{&quot;date-parts&quot;:[[2025]]},&quot;publisher&quot;:&quot;Online&quot;,&quot;volume&quot;:&quot;07&quot;,&quot;container-title-short&quot;:&quot;&quot;},&quot;isTemporary&quot;:false,&quot;suppress-author&quot;:false,&quot;composite&quot;:false,&quot;author-only&quot;:false}]},{&quot;citationID&quot;:&quot;MENDELEY_CITATION_671e1178-7df1-4f1d-ab6c-5b102c6271cd&quot;,&quot;properties&quot;:{&quot;noteIndex&quot;:0},&quot;isEdited&quot;:false,&quot;manualOverride&quot;:{&quot;isManuallyOverridden&quot;:false,&quot;citeprocText&quot;:&quot;[11]&quot;,&quot;manualOverrideText&quot;:&quot;&quot;},&quot;citationTag&quot;:&quot;MENDELEY_CITATION_v3_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&quot;,&quot;citationItems&quot;:[{&quot;id&quot;:&quot;4f180aef-3212-34f5-b147-dcd03967a16f&quot;,&quot;itemData&quot;:{&quot;type&quot;:&quot;article-journal&quot;,&quot;id&quot;:&quot;4f180aef-3212-34f5-b147-dcd03967a16f&quot;,&quot;title&quot;:&quot;Analisis Komparatif Algoritma Machine Learning dengan Metrik Akurasi, Presisi, Recall, dan F1-Score pada Dataset Kacang Kering&quot;,&quot;author&quot;:[{&quot;family&quot;:&quot;Helmiyah&quot;,&quot;given&quot;:&quot;Siti&quot;,&quot;parse-names&quot;:false,&quot;dropping-particle&quot;:&quot;&quot;,&quot;non-dropping-particle&quot;:&quot;&quot;},{&quot;family&quot;:&quot;Pramestiawan&quot;,&quot;given&quot;:&quot;Rico&quot;,&quot;parse-names&quot;:false,&quot;dropping-particle&quot;:&quot;&quot;,&quot;non-dropping-particle&quot;:&quot;&quot;}],&quot;container-title&quot;:&quot;Jurnal Ilmu Komputer dan Teknologi&quot;,&quot;DOI&quot;:&quot;10.35960/ikomti.v6i3.2031&quot;,&quot;ISSN&quot;:&quot;2746-4237&quot;,&quot;URL&quot;:&quot;https://ejournal.uhb.ac.id/index.php/IKOMTI/article/view/2031&quot;,&quot;issued&quot;:{&quot;date-parts&quot;:[[2025,10,30]]},&quot;page&quot;:&quot;152-159&quot;,&quot;abstract&quot;:&quot;&lt;p&gt;This study aims to compare the performance of five machine learning algorithms in classifying dry bean varieties as an effort to support quality detection systems for agricultural products. Issues related to authenticity and food safety that frequently occur, such as rice adulteration, highlight the importance of fast and accurate methods for variety identification. The study utilizes the Dry Bean Dataset from the UCI Machine Learning Repository, which consists of 13,611 samples with 16 numerical features and 7 classes of bean varieties. Five algorithms were tested, including K-Nearest Neighbors (KNN), Decision Tree (DT), Support Vector Machine (SVM), Random Forest (RF), and Logistic Regression (LR). The data were divided into 80% for training and 20% for testing, and evaluated using accuracy, precision, recall, and F1-Score metrics. The results show that the SVM algorithm achieved the best performance with an accuracy of 92.43% and an F1-Score of 93.61%, followed by Logistic Regression and Random Forest. The confusion matrix analysis indicates that most varieties were correctly classified, although some misclassifications occurred among classes with similar morphological characteristics such as Dermason, Seker, and Sira. Based on these findings, it can be concluded that selecting the appropriate algorithm is crucial in applying machine learning for agricultural product classification. Evaluation using multiple metrics provides a more comprehensive performance overview compared to relying solely on accuracy. This approach has the potential to support more efficient automation in the identification of agricultural product varieties.&lt;/p&gt;&quot;,&quot;issue&quot;:&quot;3&quot;,&quot;volume&quot;:&quot;6&quot;,&quot;container-title-short&quot;:&quot;&quot;},&quot;isTemporary&quot;:false}]}]"/>
     <we:property name="MENDELEY_CITATIONS_STYLE" value="{&quot;id&quot;:&quot;https://www.zotero.org/styles/ieee&quot;,&quot;title&quot;:&quot;IEEE Reference Guide version 11.29.2023&quot;,&quot;format&quot;:&quot;numeric&quot;,&quot;defaultLocale&quot;:null,&quot;isLocaleCodeValid&quot;:true}"/>
   </we:properties>
   <we:bindings/>

</xml_diff>